<commit_message>
Conference paper: single-author, update affiliation
- Removed Prof. Borah and Prof. Siwal as co-authors per author request;
  kept both named in Acknowledgments instead (Phase 1 / Phase 2 guides)
- Affiliation changed to "1*Student - M.Tech Data Science and AI, PES
  University, Hosur Rd, Konappana Agrahara, Bangalore, 560100,
  Karnataka, India" across .doc/.docx/.tex
- Reworded the Octree-detector citation (no longer "a supervising
  author") and "author's" (was "authors'") in Reproducibility
- Verified page count holds at 12 (both .doc and .docx render) after
  the author-block change

Co-Authored-By: Claude Sonnet 5 <noreply@anthropic.com>
</commit_message>
<xml_diff>
--- a/Review_files/Conference paper submission/ParthasarathyPerumal_fullpaper.docx
+++ b/Review_files/Conference paper submission/ParthasarathyPerumal_fullpaper.docx
@@ -29,7 +29,7 @@
           <w:sz w:val="20"/>
           <w:szCs w:val="20"/>
         </w:rPr>
-        <w:t xml:space="preserve">Parthasarathy Perumal, Sagarika Borah, Gaurav Siwal</w:t>
+        <w:t xml:space="preserve">Parthasarathy Perumal</w:t>
       </w:r>
     </w:p>
     <w:p>
@@ -45,7 +45,7 @@
           <w:sz w:val="18"/>
           <w:szCs w:val="18"/>
         </w:rPr>
-        <w:t xml:space="preserve">Department of Data Science and Artificial Intelligence, PES University, Electronic City Campus, Bengaluru 560100, Karnataka, India</w:t>
+        <w:t xml:space="preserve">1*Student – M.Tech Data Science and AI, PES University, Hosur Rd, Konappana Agrahara, Bangalore, 560100, Karnataka, India</w:t>
       </w:r>
     </w:p>
     <w:p>
@@ -1615,7 +1615,7 @@
           <w:sz w:val="20"/>
           <w:szCs w:val="20"/>
         </w:rPr>
-        <w:t xml:space="preserve">To locate where a missing component likely attaches without depending on a proprietary CAD-kernel API at inference time, an octree spatial partition — adapting the octree concept from prior watermarking work by one of this paper's supervising authors [15] — clusters the free-surface (unmated) face centroids of each body after the same fragmentation step used for graph construction. Dense clusters of free-surface area flag candidate open joints directly from raw mesh geometry, independent of and complementary to the Phase I link-prediction signal.</w:t>
+        <w:t xml:space="preserve">To locate where a missing component likely attaches without depending on a proprietary CAD-kernel API at inference time, an octree spatial partition — adapting the octree concept from prior mesh-watermarking work [15] — clusters the free-surface (unmated) face centroids of each body after the same fragmentation step used for graph construction. Dense clusters of free-surface area flag candidate open joints directly from raw mesh geometry, independent of and complementary to the Phase I link-prediction signal.</w:t>
       </w:r>
     </w:p>
     <w:p>
@@ -5171,7 +5171,7 @@
           <w:sz w:val="20"/>
           <w:szCs w:val="20"/>
         </w:rPr>
-        <w:t xml:space="preserve">All five-fold cross-validation splits are seeded per fold and per graph, so a checkpoint's reported metrics are exactly reproducible from the same corpus snapshot. The 749-model corpus, all training and evaluation scripts, the trained checkpoints referenced in Tables 3–5, and the exploratory-analysis notebook behind Section 9.3's findings are maintained in the authors' project repository and available on request.</w:t>
+        <w:t xml:space="preserve">All five-fold cross-validation splits are seeded per fold and per graph, so a checkpoint's reported metrics are exactly reproducible from the same corpus snapshot. The 749-model corpus, all training and evaluation scripts, the trained checkpoints referenced in Tables 3–5, and the exploratory-analysis notebook behind Section 9.3's findings are maintained in the author's project repository and available on request.</w:t>
       </w:r>
     </w:p>
     <w:p>
@@ -5196,7 +5196,7 @@
           <w:sz w:val="20"/>
           <w:szCs w:val="20"/>
         </w:rPr>
-        <w:t xml:space="preserve">We thank the Department of Data Science and Artificial Intelligence at PES University for guidance and review throughout Phase 1 and Phase 2 of this M.Tech project.</w:t>
+        <w:t xml:space="preserve">I thank Prof. Sagarika Borah (Phase 1 guide) and Prof. Gaurav Siwal (Phase 2 guide), and the Department of Data Science and Artificial Intelligence at PES University, for guidance and review throughout this M.Tech project.</w:t>
       </w:r>
     </w:p>
     <w:p>

</xml_diff>

<commit_message>
Conference paper: add corresponding-author email note
Adds "Corresponding author(s). E-mail(s): parthasarathy.perumal@gmail.com;"
below the affiliation line in .doc/.docx/.tex. Page count unchanged (12).

Co-Authored-By: Claude Sonnet 5 <noreply@anthropic.com>
</commit_message>
<xml_diff>
--- a/Review_files/Conference paper submission/ParthasarathyPerumal_fullpaper.docx
+++ b/Review_files/Conference paper submission/ParthasarathyPerumal_fullpaper.docx
@@ -34,7 +34,7 @@
     </w:p>
     <w:p>
       <w:pPr>
-        <w:spacing w:after="240"/>
+        <w:spacing w:after="40"/>
         <w:jc w:val="center"/>
       </w:pPr>
       <w:r>
@@ -46,6 +46,22 @@
           <w:szCs w:val="18"/>
         </w:rPr>
         <w:t xml:space="preserve">1*Student – M.Tech Data Science and AI, PES University, Hosur Rd, Konappana Agrahara, Bangalore, 560100, Karnataka, India</w:t>
+      </w:r>
+    </w:p>
+    <w:p>
+      <w:pPr>
+        <w:spacing w:after="240"/>
+        <w:jc w:val="center"/>
+      </w:pPr>
+      <w:r>
+        <w:rPr>
+          <w:rFonts w:ascii="Times New Roman" w:cs="Times New Roman" w:eastAsia="Times New Roman" w:hAnsi="Times New Roman"/>
+          <w:i/>
+          <w:iCs/>
+          <w:sz w:val="18"/>
+          <w:szCs w:val="18"/>
+        </w:rPr>
+        <w:t xml:space="preserve">Corresponding author(s). E-mail(s): parthasarathy.perumal@gmail.com;</w:t>
       </w:r>
     </w:p>
     <w:p>

</xml_diff>

<commit_message>
Conference paper: superscript author marker + clickable email
- Author name now renders "Parthasarathy Perumal" with a superscript
  "1*" (affiliation index + corresponding-author marker) in .doc/.docx;
  .tex already generates this automatically from \author*[1]{...}, so
  left untouched there to avoid doubling the marker
- Corresponding-author email is now a real mailto: hyperlink in both
  .doc/.docx (blue, underlined) and .tex (\href, sn-jnl already loads
  hyperref)
- Page count unchanged (12)

Co-Authored-By: Claude Sonnet 5 <noreply@anthropic.com>
</commit_message>
<xml_diff>
--- a/Review_files/Conference paper submission/ParthasarathyPerumal_fullpaper.docx
+++ b/Review_files/Conference paper submission/ParthasarathyPerumal_fullpaper.docx
@@ -31,6 +31,15 @@
         </w:rPr>
         <w:t xml:space="preserve">Parthasarathy Perumal</w:t>
       </w:r>
+      <w:r>
+        <w:rPr>
+          <w:rFonts w:ascii="Times New Roman" w:cs="Times New Roman" w:eastAsia="Times New Roman" w:hAnsi="Times New Roman"/>
+          <w:sz w:val="20"/>
+          <w:szCs w:val="20"/>
+          <w:vertAlign w:val="superscript"/>
+        </w:rPr>
+        <w:t xml:space="preserve">1*</w:t>
+      </w:r>
     </w:p>
     <w:p>
       <w:pPr>
@@ -61,7 +70,32 @@
           <w:sz w:val="18"/>
           <w:szCs w:val="18"/>
         </w:rPr>
-        <w:t xml:space="preserve">Corresponding author(s). E-mail(s): parthasarathy.perumal@gmail.com;</w:t>
+        <w:t xml:space="preserve">Corresponding author(s). E-mail(s): </w:t>
+      </w:r>
+      <w:hyperlink w:history="1" r:id="rIdjgtpzpcr43-eoqbtpb8tf">
+        <w:r>
+          <w:rPr>
+            <w:rStyle w:val="Hyperlink"/>
+            <w:rFonts w:ascii="Times New Roman" w:cs="Times New Roman" w:eastAsia="Times New Roman" w:hAnsi="Times New Roman"/>
+            <w:i/>
+            <w:iCs/>
+            <w:color w:val="1155CC"/>
+            <w:sz w:val="18"/>
+            <w:szCs w:val="18"/>
+            <w:u w:val="single"/>
+          </w:rPr>
+          <w:t xml:space="preserve">parthasarathy.perumal@gmail.com</w:t>
+        </w:r>
+      </w:hyperlink>
+      <w:r>
+        <w:rPr>
+          <w:rFonts w:ascii="Times New Roman" w:cs="Times New Roman" w:eastAsia="Times New Roman" w:hAnsi="Times New Roman"/>
+          <w:i/>
+          <w:iCs/>
+          <w:sz w:val="18"/>
+          <w:szCs w:val="18"/>
+        </w:rPr>
+        <w:t xml:space="preserve">;</w:t>
       </w:r>
     </w:p>
     <w:p>

</xml_diff>

<commit_message>
Conference paper: de-italicize affiliation and corresponding-author lines
Both lines now render in plain (non-italic) text in .doc/.docx/.tex.
Page count unchanged (12).

Co-Authored-By: Claude Sonnet 5 <noreply@anthropic.com>
</commit_message>
<xml_diff>
--- a/Review_files/Conference paper submission/ParthasarathyPerumal_fullpaper.docx
+++ b/Review_files/Conference paper submission/ParthasarathyPerumal_fullpaper.docx
@@ -49,8 +49,6 @@
       <w:r>
         <w:rPr>
           <w:rFonts w:ascii="Times New Roman" w:cs="Times New Roman" w:eastAsia="Times New Roman" w:hAnsi="Times New Roman"/>
-          <w:i/>
-          <w:iCs/>
           <w:sz w:val="18"/>
           <w:szCs w:val="18"/>
         </w:rPr>
@@ -65,20 +63,16 @@
       <w:r>
         <w:rPr>
           <w:rFonts w:ascii="Times New Roman" w:cs="Times New Roman" w:eastAsia="Times New Roman" w:hAnsi="Times New Roman"/>
-          <w:i/>
-          <w:iCs/>
           <w:sz w:val="18"/>
           <w:szCs w:val="18"/>
         </w:rPr>
         <w:t xml:space="preserve">Corresponding author(s). E-mail(s): </w:t>
       </w:r>
-      <w:hyperlink w:history="1" r:id="rIdjgtpzpcr43-eoqbtpb8tf">
+      <w:hyperlink w:history="1" r:id="rIdey6uxiohnlr39_cbsfdg-">
         <w:r>
           <w:rPr>
             <w:rStyle w:val="Hyperlink"/>
             <w:rFonts w:ascii="Times New Roman" w:cs="Times New Roman" w:eastAsia="Times New Roman" w:hAnsi="Times New Roman"/>
-            <w:i/>
-            <w:iCs/>
             <w:color w:val="1155CC"/>
             <w:sz w:val="18"/>
             <w:szCs w:val="18"/>
@@ -90,8 +84,6 @@
       <w:r>
         <w:rPr>
           <w:rFonts w:ascii="Times New Roman" w:cs="Times New Roman" w:eastAsia="Times New Roman" w:hAnsi="Times New Roman"/>
-          <w:i/>
-          <w:iCs/>
           <w:sz w:val="18"/>
           <w:szCs w:val="18"/>
         </w:rPr>

</xml_diff>

<commit_message>
Conference paper: add line space between affiliation and corresponding-author lines
.doc/.docx: inserted a blank paragraph between the two. .tex: added
\bigskip between \affil* and the corresponding-author note. Page
count unchanged (12).

Co-Authored-By: Claude Sonnet 5 <noreply@anthropic.com>
</commit_message>
<xml_diff>
--- a/Review_files/Conference paper submission/ParthasarathyPerumal_fullpaper.docx
+++ b/Review_files/Conference paper submission/ParthasarathyPerumal_fullpaper.docx
@@ -56,6 +56,16 @@
       </w:r>
     </w:p>
     <w:p>
+      <w:r>
+        <w:rPr>
+          <w:rFonts w:ascii="Times New Roman" w:cs="Times New Roman" w:eastAsia="Times New Roman" w:hAnsi="Times New Roman"/>
+          <w:sz w:val="18"/>
+          <w:szCs w:val="18"/>
+        </w:rPr>
+        <w:t xml:space="preserve"/>
+      </w:r>
+    </w:p>
+    <w:p>
       <w:pPr>
         <w:spacing w:after="240"/>
         <w:jc w:val="center"/>
@@ -68,7 +78,7 @@
         </w:rPr>
         <w:t xml:space="preserve">Corresponding author(s). E-mail(s): </w:t>
       </w:r>
-      <w:hyperlink w:history="1" r:id="rIdey6uxiohnlr39_cbsfdg-">
+      <w:hyperlink w:history="1" r:id="rIdwdawfj82hhph_2g2avcsr">
         <w:r>
           <w:rPr>
             <w:rStyle w:val="Hyperlink"/>

</xml_diff>

<commit_message>
Conference paper: fix tables overflowing past the page margin
All 5 tables (Training config, Corpus composition, Phase I results,
ablation runs, per-class Hit@1) had column-width sums exceeding the
6918-twip usable text width (up to 9300), so they spilled past the
right margin in .doc/.docx. Rescaled every table's column widths
proportionally to fit within the margins.

.tex carried the same risk in its two prose-heavy tables (hyperparams,
ablation) since plain tabular columns don't wrap -- converted both to
tabularx with X-columns so they're guaranteed to span exactly
\linewidth regardless of content length.

Page count unchanged (12). PDF copy refreshed to match.

Co-Authored-By: Claude Sonnet 5 <noreply@anthropic.com>
</commit_message>
<xml_diff>
--- a/Review_files/Conference paper submission/ParthasarathyPerumal_fullpaper.docx
+++ b/Review_files/Conference paper submission/ParthasarathyPerumal_fullpaper.docx
@@ -78,7 +78,7 @@
         </w:rPr>
         <w:t xml:space="preserve">Corresponding author(s). E-mail(s): </w:t>
       </w:r>
-      <w:hyperlink w:history="1" r:id="rIdz88sqpgkaly2fwfpj7c0l">
+      <w:hyperlink w:history="1" r:id="rIddbub6xu8xy4d5xxxr_nvv">
         <w:r>
           <w:rPr>
             <w:rStyle w:val="Hyperlink"/>
@@ -1349,7 +1349,7 @@
     </w:p>
     <w:tbl>
       <w:tblPr>
-        <w:tblW w:type="dxa" w:w="9300"/>
+        <w:tblW w:type="dxa" w:w="6899"/>
         <w:tblBorders>
           <w:top w:val="single" w:color="auto" w:sz="4"/>
           <w:left w:val="single" w:color="auto" w:sz="4"/>
@@ -1360,14 +1360,14 @@
         </w:tblBorders>
       </w:tblPr>
       <w:tblGrid>
-        <w:gridCol w:w="2300"/>
-        <w:gridCol w:w="3400"/>
-        <w:gridCol w:w="3600"/>
+        <w:gridCol w:w="1706"/>
+        <w:gridCol w:w="2522"/>
+        <w:gridCol w:w="2671"/>
       </w:tblGrid>
       <w:tr>
         <w:tc>
           <w:tcPr>
-            <w:tcW w:type="dxa" w:w="2300"/>
+            <w:tcW w:type="dxa" w:w="1706"/>
             <w:shd w:fill="E8ECF5" w:val="clear"/>
             <w:tcMar>
               <w:top w:type="dxa" w:w="30"/>
@@ -1394,7 +1394,7 @@
         </w:tc>
         <w:tc>
           <w:tcPr>
-            <w:tcW w:type="dxa" w:w="3400"/>
+            <w:tcW w:type="dxa" w:w="2522"/>
             <w:shd w:fill="E8ECF5" w:val="clear"/>
             <w:tcMar>
               <w:top w:type="dxa" w:w="30"/>
@@ -1421,7 +1421,7 @@
         </w:tc>
         <w:tc>
           <w:tcPr>
-            <w:tcW w:type="dxa" w:w="3600"/>
+            <w:tcW w:type="dxa" w:w="2671"/>
             <w:shd w:fill="E8ECF5" w:val="clear"/>
             <w:tcMar>
               <w:top w:type="dxa" w:w="30"/>
@@ -1450,7 +1450,7 @@
       <w:tr>
         <w:tc>
           <w:tcPr>
-            <w:tcW w:type="dxa" w:w="2300"/>
+            <w:tcW w:type="dxa" w:w="1706"/>
             <w:tcMar>
               <w:top w:type="dxa" w:w="30"/>
               <w:left w:type="dxa" w:w="100"/>
@@ -1476,7 +1476,7 @@
         </w:tc>
         <w:tc>
           <w:tcPr>
-            <w:tcW w:type="dxa" w:w="3400"/>
+            <w:tcW w:type="dxa" w:w="2522"/>
             <w:tcMar>
               <w:top w:type="dxa" w:w="30"/>
               <w:left w:type="dxa" w:w="100"/>
@@ -1502,7 +1502,7 @@
         </w:tc>
         <w:tc>
           <w:tcPr>
-            <w:tcW w:type="dxa" w:w="3600"/>
+            <w:tcW w:type="dxa" w:w="2671"/>
             <w:tcMar>
               <w:top w:type="dxa" w:w="30"/>
               <w:left w:type="dxa" w:w="100"/>
@@ -1530,7 +1530,7 @@
       <w:tr>
         <w:tc>
           <w:tcPr>
-            <w:tcW w:type="dxa" w:w="2300"/>
+            <w:tcW w:type="dxa" w:w="1706"/>
             <w:tcMar>
               <w:top w:type="dxa" w:w="30"/>
               <w:left w:type="dxa" w:w="100"/>
@@ -1556,7 +1556,7 @@
         </w:tc>
         <w:tc>
           <w:tcPr>
-            <w:tcW w:type="dxa" w:w="3400"/>
+            <w:tcW w:type="dxa" w:w="2522"/>
             <w:tcMar>
               <w:top w:type="dxa" w:w="30"/>
               <w:left w:type="dxa" w:w="100"/>
@@ -1582,7 +1582,7 @@
         </w:tc>
         <w:tc>
           <w:tcPr>
-            <w:tcW w:type="dxa" w:w="3600"/>
+            <w:tcW w:type="dxa" w:w="2671"/>
             <w:tcMar>
               <w:top w:type="dxa" w:w="30"/>
               <w:left w:type="dxa" w:w="100"/>
@@ -1610,7 +1610,7 @@
       <w:tr>
         <w:tc>
           <w:tcPr>
-            <w:tcW w:type="dxa" w:w="2300"/>
+            <w:tcW w:type="dxa" w:w="1706"/>
             <w:tcMar>
               <w:top w:type="dxa" w:w="30"/>
               <w:left w:type="dxa" w:w="100"/>
@@ -1636,7 +1636,7 @@
         </w:tc>
         <w:tc>
           <w:tcPr>
-            <w:tcW w:type="dxa" w:w="3400"/>
+            <w:tcW w:type="dxa" w:w="2522"/>
             <w:tcMar>
               <w:top w:type="dxa" w:w="30"/>
               <w:left w:type="dxa" w:w="100"/>
@@ -1662,7 +1662,7 @@
         </w:tc>
         <w:tc>
           <w:tcPr>
-            <w:tcW w:type="dxa" w:w="3600"/>
+            <w:tcW w:type="dxa" w:w="2671"/>
             <w:tcMar>
               <w:top w:type="dxa" w:w="30"/>
               <w:left w:type="dxa" w:w="100"/>
@@ -1690,7 +1690,7 @@
       <w:tr>
         <w:tc>
           <w:tcPr>
-            <w:tcW w:type="dxa" w:w="2300"/>
+            <w:tcW w:type="dxa" w:w="1706"/>
             <w:tcMar>
               <w:top w:type="dxa" w:w="30"/>
               <w:left w:type="dxa" w:w="100"/>
@@ -1716,7 +1716,7 @@
         </w:tc>
         <w:tc>
           <w:tcPr>
-            <w:tcW w:type="dxa" w:w="3400"/>
+            <w:tcW w:type="dxa" w:w="2522"/>
             <w:tcMar>
               <w:top w:type="dxa" w:w="30"/>
               <w:left w:type="dxa" w:w="100"/>
@@ -1742,7 +1742,7 @@
         </w:tc>
         <w:tc>
           <w:tcPr>
-            <w:tcW w:type="dxa" w:w="3600"/>
+            <w:tcW w:type="dxa" w:w="2671"/>
             <w:tcMar>
               <w:top w:type="dxa" w:w="30"/>
               <w:left w:type="dxa" w:w="100"/>
@@ -1770,7 +1770,7 @@
       <w:tr>
         <w:tc>
           <w:tcPr>
-            <w:tcW w:type="dxa" w:w="2300"/>
+            <w:tcW w:type="dxa" w:w="1706"/>
             <w:tcMar>
               <w:top w:type="dxa" w:w="30"/>
               <w:left w:type="dxa" w:w="100"/>
@@ -1796,7 +1796,7 @@
         </w:tc>
         <w:tc>
           <w:tcPr>
-            <w:tcW w:type="dxa" w:w="3400"/>
+            <w:tcW w:type="dxa" w:w="2522"/>
             <w:tcMar>
               <w:top w:type="dxa" w:w="30"/>
               <w:left w:type="dxa" w:w="100"/>
@@ -1822,7 +1822,7 @@
         </w:tc>
         <w:tc>
           <w:tcPr>
-            <w:tcW w:type="dxa" w:w="3600"/>
+            <w:tcW w:type="dxa" w:w="2671"/>
             <w:tcMar>
               <w:top w:type="dxa" w:w="30"/>
               <w:left w:type="dxa" w:w="100"/>
@@ -1850,7 +1850,7 @@
       <w:tr>
         <w:tc>
           <w:tcPr>
-            <w:tcW w:type="dxa" w:w="2300"/>
+            <w:tcW w:type="dxa" w:w="1706"/>
             <w:tcMar>
               <w:top w:type="dxa" w:w="30"/>
               <w:left w:type="dxa" w:w="100"/>
@@ -1876,7 +1876,7 @@
         </w:tc>
         <w:tc>
           <w:tcPr>
-            <w:tcW w:type="dxa" w:w="3400"/>
+            <w:tcW w:type="dxa" w:w="2522"/>
             <w:tcMar>
               <w:top w:type="dxa" w:w="30"/>
               <w:left w:type="dxa" w:w="100"/>
@@ -1902,7 +1902,7 @@
         </w:tc>
         <w:tc>
           <w:tcPr>
-            <w:tcW w:type="dxa" w:w="3600"/>
+            <w:tcW w:type="dxa" w:w="2671"/>
             <w:tcMar>
               <w:top w:type="dxa" w:w="30"/>
               <w:left w:type="dxa" w:w="100"/>
@@ -1930,7 +1930,7 @@
       <w:tr>
         <w:tc>
           <w:tcPr>
-            <w:tcW w:type="dxa" w:w="2300"/>
+            <w:tcW w:type="dxa" w:w="1706"/>
             <w:tcMar>
               <w:top w:type="dxa" w:w="30"/>
               <w:left w:type="dxa" w:w="100"/>
@@ -1956,7 +1956,7 @@
         </w:tc>
         <w:tc>
           <w:tcPr>
-            <w:tcW w:type="dxa" w:w="3400"/>
+            <w:tcW w:type="dxa" w:w="2522"/>
             <w:tcMar>
               <w:top w:type="dxa" w:w="30"/>
               <w:left w:type="dxa" w:w="100"/>
@@ -1982,7 +1982,7 @@
         </w:tc>
         <w:tc>
           <w:tcPr>
-            <w:tcW w:type="dxa" w:w="3600"/>
+            <w:tcW w:type="dxa" w:w="2671"/>
             <w:tcMar>
               <w:top w:type="dxa" w:w="30"/>
               <w:left w:type="dxa" w:w="100"/>
@@ -2663,7 +2663,7 @@
     </w:p>
     <w:tbl>
       <w:tblPr>
-        <w:tblW w:type="dxa" w:w="9300"/>
+        <w:tblW w:type="dxa" w:w="6900"/>
         <w:tblBorders>
           <w:top w:val="single" w:color="auto" w:sz="4"/>
           <w:left w:val="single" w:color="auto" w:sz="4"/>
@@ -2674,16 +2674,16 @@
         </w:tblBorders>
       </w:tblPr>
       <w:tblGrid>
-        <w:gridCol w:w="2000"/>
-        <w:gridCol w:w="1600"/>
-        <w:gridCol w:w="1400"/>
-        <w:gridCol w:w="2400"/>
-        <w:gridCol w:w="1900"/>
+        <w:gridCol w:w="1484"/>
+        <w:gridCol w:w="1187"/>
+        <w:gridCol w:w="1039"/>
+        <w:gridCol w:w="1781"/>
+        <w:gridCol w:w="1409"/>
       </w:tblGrid>
       <w:tr>
         <w:tc>
           <w:tcPr>
-            <w:tcW w:type="dxa" w:w="2000"/>
+            <w:tcW w:type="dxa" w:w="1484"/>
             <w:shd w:fill="E8ECF5" w:val="clear"/>
             <w:tcMar>
               <w:top w:type="dxa" w:w="30"/>
@@ -2710,7 +2710,7 @@
         </w:tc>
         <w:tc>
           <w:tcPr>
-            <w:tcW w:type="dxa" w:w="1600"/>
+            <w:tcW w:type="dxa" w:w="1187"/>
             <w:shd w:fill="E8ECF5" w:val="clear"/>
             <w:tcMar>
               <w:top w:type="dxa" w:w="30"/>
@@ -2737,7 +2737,7 @@
         </w:tc>
         <w:tc>
           <w:tcPr>
-            <w:tcW w:type="dxa" w:w="1400"/>
+            <w:tcW w:type="dxa" w:w="1039"/>
             <w:shd w:fill="E8ECF5" w:val="clear"/>
             <w:tcMar>
               <w:top w:type="dxa" w:w="30"/>
@@ -2764,7 +2764,7 @@
         </w:tc>
         <w:tc>
           <w:tcPr>
-            <w:tcW w:type="dxa" w:w="2400"/>
+            <w:tcW w:type="dxa" w:w="1781"/>
             <w:shd w:fill="E8ECF5" w:val="clear"/>
             <w:tcMar>
               <w:top w:type="dxa" w:w="30"/>
@@ -2791,7 +2791,7 @@
         </w:tc>
         <w:tc>
           <w:tcPr>
-            <w:tcW w:type="dxa" w:w="1900"/>
+            <w:tcW w:type="dxa" w:w="1409"/>
             <w:shd w:fill="E8ECF5" w:val="clear"/>
             <w:tcMar>
               <w:top w:type="dxa" w:w="30"/>
@@ -2820,7 +2820,7 @@
       <w:tr>
         <w:tc>
           <w:tcPr>
-            <w:tcW w:type="dxa" w:w="2000"/>
+            <w:tcW w:type="dxa" w:w="1484"/>
             <w:tcMar>
               <w:top w:type="dxa" w:w="30"/>
               <w:left w:type="dxa" w:w="100"/>
@@ -2846,7 +2846,7 @@
         </w:tc>
         <w:tc>
           <w:tcPr>
-            <w:tcW w:type="dxa" w:w="1600"/>
+            <w:tcW w:type="dxa" w:w="1187"/>
             <w:tcMar>
               <w:top w:type="dxa" w:w="30"/>
               <w:left w:type="dxa" w:w="100"/>
@@ -2872,7 +2872,7 @@
         </w:tc>
         <w:tc>
           <w:tcPr>
-            <w:tcW w:type="dxa" w:w="1400"/>
+            <w:tcW w:type="dxa" w:w="1039"/>
             <w:tcMar>
               <w:top w:type="dxa" w:w="30"/>
               <w:left w:type="dxa" w:w="100"/>
@@ -2898,7 +2898,7 @@
         </w:tc>
         <w:tc>
           <w:tcPr>
-            <w:tcW w:type="dxa" w:w="2400"/>
+            <w:tcW w:type="dxa" w:w="1781"/>
             <w:tcMar>
               <w:top w:type="dxa" w:w="30"/>
               <w:left w:type="dxa" w:w="100"/>
@@ -2924,7 +2924,7 @@
         </w:tc>
         <w:tc>
           <w:tcPr>
-            <w:tcW w:type="dxa" w:w="1900"/>
+            <w:tcW w:type="dxa" w:w="1409"/>
             <w:tcMar>
               <w:top w:type="dxa" w:w="30"/>
               <w:left w:type="dxa" w:w="100"/>
@@ -2952,7 +2952,7 @@
       <w:tr>
         <w:tc>
           <w:tcPr>
-            <w:tcW w:type="dxa" w:w="2000"/>
+            <w:tcW w:type="dxa" w:w="1484"/>
             <w:tcMar>
               <w:top w:type="dxa" w:w="30"/>
               <w:left w:type="dxa" w:w="100"/>
@@ -2978,7 +2978,7 @@
         </w:tc>
         <w:tc>
           <w:tcPr>
-            <w:tcW w:type="dxa" w:w="1600"/>
+            <w:tcW w:type="dxa" w:w="1187"/>
             <w:tcMar>
               <w:top w:type="dxa" w:w="30"/>
               <w:left w:type="dxa" w:w="100"/>
@@ -3004,7 +3004,7 @@
         </w:tc>
         <w:tc>
           <w:tcPr>
-            <w:tcW w:type="dxa" w:w="1400"/>
+            <w:tcW w:type="dxa" w:w="1039"/>
             <w:tcMar>
               <w:top w:type="dxa" w:w="30"/>
               <w:left w:type="dxa" w:w="100"/>
@@ -3030,7 +3030,7 @@
         </w:tc>
         <w:tc>
           <w:tcPr>
-            <w:tcW w:type="dxa" w:w="2400"/>
+            <w:tcW w:type="dxa" w:w="1781"/>
             <w:tcMar>
               <w:top w:type="dxa" w:w="30"/>
               <w:left w:type="dxa" w:w="100"/>
@@ -3056,7 +3056,7 @@
         </w:tc>
         <w:tc>
           <w:tcPr>
-            <w:tcW w:type="dxa" w:w="1900"/>
+            <w:tcW w:type="dxa" w:w="1409"/>
             <w:tcMar>
               <w:top w:type="dxa" w:w="30"/>
               <w:left w:type="dxa" w:w="100"/>
@@ -3084,7 +3084,7 @@
       <w:tr>
         <w:tc>
           <w:tcPr>
-            <w:tcW w:type="dxa" w:w="2000"/>
+            <w:tcW w:type="dxa" w:w="1484"/>
             <w:tcMar>
               <w:top w:type="dxa" w:w="30"/>
               <w:left w:type="dxa" w:w="100"/>
@@ -3110,7 +3110,7 @@
         </w:tc>
         <w:tc>
           <w:tcPr>
-            <w:tcW w:type="dxa" w:w="1600"/>
+            <w:tcW w:type="dxa" w:w="1187"/>
             <w:tcMar>
               <w:top w:type="dxa" w:w="30"/>
               <w:left w:type="dxa" w:w="100"/>
@@ -3136,7 +3136,7 @@
         </w:tc>
         <w:tc>
           <w:tcPr>
-            <w:tcW w:type="dxa" w:w="1400"/>
+            <w:tcW w:type="dxa" w:w="1039"/>
             <w:tcMar>
               <w:top w:type="dxa" w:w="30"/>
               <w:left w:type="dxa" w:w="100"/>
@@ -3162,7 +3162,7 @@
         </w:tc>
         <w:tc>
           <w:tcPr>
-            <w:tcW w:type="dxa" w:w="2400"/>
+            <w:tcW w:type="dxa" w:w="1781"/>
             <w:tcMar>
               <w:top w:type="dxa" w:w="30"/>
               <w:left w:type="dxa" w:w="100"/>
@@ -3188,7 +3188,7 @@
         </w:tc>
         <w:tc>
           <w:tcPr>
-            <w:tcW w:type="dxa" w:w="1900"/>
+            <w:tcW w:type="dxa" w:w="1409"/>
             <w:tcMar>
               <w:top w:type="dxa" w:w="30"/>
               <w:left w:type="dxa" w:w="100"/>
@@ -3216,7 +3216,7 @@
       <w:tr>
         <w:tc>
           <w:tcPr>
-            <w:tcW w:type="dxa" w:w="2000"/>
+            <w:tcW w:type="dxa" w:w="1484"/>
             <w:tcMar>
               <w:top w:type="dxa" w:w="30"/>
               <w:left w:type="dxa" w:w="100"/>
@@ -3242,7 +3242,7 @@
         </w:tc>
         <w:tc>
           <w:tcPr>
-            <w:tcW w:type="dxa" w:w="1600"/>
+            <w:tcW w:type="dxa" w:w="1187"/>
             <w:tcMar>
               <w:top w:type="dxa" w:w="30"/>
               <w:left w:type="dxa" w:w="100"/>
@@ -3268,7 +3268,7 @@
         </w:tc>
         <w:tc>
           <w:tcPr>
-            <w:tcW w:type="dxa" w:w="1400"/>
+            <w:tcW w:type="dxa" w:w="1039"/>
             <w:tcMar>
               <w:top w:type="dxa" w:w="30"/>
               <w:left w:type="dxa" w:w="100"/>
@@ -3294,7 +3294,7 @@
         </w:tc>
         <w:tc>
           <w:tcPr>
-            <w:tcW w:type="dxa" w:w="2400"/>
+            <w:tcW w:type="dxa" w:w="1781"/>
             <w:tcMar>
               <w:top w:type="dxa" w:w="30"/>
               <w:left w:type="dxa" w:w="100"/>
@@ -3320,7 +3320,7 @@
         </w:tc>
         <w:tc>
           <w:tcPr>
-            <w:tcW w:type="dxa" w:w="1900"/>
+            <w:tcW w:type="dxa" w:w="1409"/>
             <w:tcMar>
               <w:top w:type="dxa" w:w="30"/>
               <w:left w:type="dxa" w:w="100"/>
@@ -3348,7 +3348,7 @@
       <w:tr>
         <w:tc>
           <w:tcPr>
-            <w:tcW w:type="dxa" w:w="2000"/>
+            <w:tcW w:type="dxa" w:w="1484"/>
             <w:tcMar>
               <w:top w:type="dxa" w:w="30"/>
               <w:left w:type="dxa" w:w="100"/>
@@ -3374,7 +3374,7 @@
         </w:tc>
         <w:tc>
           <w:tcPr>
-            <w:tcW w:type="dxa" w:w="1600"/>
+            <w:tcW w:type="dxa" w:w="1187"/>
             <w:tcMar>
               <w:top w:type="dxa" w:w="30"/>
               <w:left w:type="dxa" w:w="100"/>
@@ -3400,7 +3400,7 @@
         </w:tc>
         <w:tc>
           <w:tcPr>
-            <w:tcW w:type="dxa" w:w="1400"/>
+            <w:tcW w:type="dxa" w:w="1039"/>
             <w:tcMar>
               <w:top w:type="dxa" w:w="30"/>
               <w:left w:type="dxa" w:w="100"/>
@@ -3426,7 +3426,7 @@
         </w:tc>
         <w:tc>
           <w:tcPr>
-            <w:tcW w:type="dxa" w:w="2400"/>
+            <w:tcW w:type="dxa" w:w="1781"/>
             <w:tcMar>
               <w:top w:type="dxa" w:w="30"/>
               <w:left w:type="dxa" w:w="100"/>
@@ -3452,7 +3452,7 @@
         </w:tc>
         <w:tc>
           <w:tcPr>
-            <w:tcW w:type="dxa" w:w="1900"/>
+            <w:tcW w:type="dxa" w:w="1409"/>
             <w:tcMar>
               <w:top w:type="dxa" w:w="30"/>
               <w:left w:type="dxa" w:w="100"/>
@@ -3480,7 +3480,7 @@
       <w:tr>
         <w:tc>
           <w:tcPr>
-            <w:tcW w:type="dxa" w:w="2000"/>
+            <w:tcW w:type="dxa" w:w="1484"/>
             <w:tcMar>
               <w:top w:type="dxa" w:w="30"/>
               <w:left w:type="dxa" w:w="100"/>
@@ -3506,7 +3506,7 @@
         </w:tc>
         <w:tc>
           <w:tcPr>
-            <w:tcW w:type="dxa" w:w="1600"/>
+            <w:tcW w:type="dxa" w:w="1187"/>
             <w:tcMar>
               <w:top w:type="dxa" w:w="30"/>
               <w:left w:type="dxa" w:w="100"/>
@@ -3532,7 +3532,7 @@
         </w:tc>
         <w:tc>
           <w:tcPr>
-            <w:tcW w:type="dxa" w:w="1400"/>
+            <w:tcW w:type="dxa" w:w="1039"/>
             <w:tcMar>
               <w:top w:type="dxa" w:w="30"/>
               <w:left w:type="dxa" w:w="100"/>
@@ -3558,7 +3558,7 @@
         </w:tc>
         <w:tc>
           <w:tcPr>
-            <w:tcW w:type="dxa" w:w="2400"/>
+            <w:tcW w:type="dxa" w:w="1781"/>
             <w:tcMar>
               <w:top w:type="dxa" w:w="30"/>
               <w:left w:type="dxa" w:w="100"/>
@@ -3584,7 +3584,7 @@
         </w:tc>
         <w:tc>
           <w:tcPr>
-            <w:tcW w:type="dxa" w:w="1900"/>
+            <w:tcW w:type="dxa" w:w="1409"/>
             <w:tcMar>
               <w:top w:type="dxa" w:w="30"/>
               <w:left w:type="dxa" w:w="100"/>
@@ -3612,7 +3612,7 @@
       <w:tr>
         <w:tc>
           <w:tcPr>
-            <w:tcW w:type="dxa" w:w="2000"/>
+            <w:tcW w:type="dxa" w:w="1484"/>
             <w:tcMar>
               <w:top w:type="dxa" w:w="30"/>
               <w:left w:type="dxa" w:w="100"/>
@@ -3638,7 +3638,7 @@
         </w:tc>
         <w:tc>
           <w:tcPr>
-            <w:tcW w:type="dxa" w:w="1600"/>
+            <w:tcW w:type="dxa" w:w="1187"/>
             <w:tcMar>
               <w:top w:type="dxa" w:w="30"/>
               <w:left w:type="dxa" w:w="100"/>
@@ -3664,7 +3664,7 @@
         </w:tc>
         <w:tc>
           <w:tcPr>
-            <w:tcW w:type="dxa" w:w="1400"/>
+            <w:tcW w:type="dxa" w:w="1039"/>
             <w:tcMar>
               <w:top w:type="dxa" w:w="30"/>
               <w:left w:type="dxa" w:w="100"/>
@@ -3690,7 +3690,7 @@
         </w:tc>
         <w:tc>
           <w:tcPr>
-            <w:tcW w:type="dxa" w:w="2400"/>
+            <w:tcW w:type="dxa" w:w="1781"/>
             <w:tcMar>
               <w:top w:type="dxa" w:w="30"/>
               <w:left w:type="dxa" w:w="100"/>
@@ -3716,7 +3716,7 @@
         </w:tc>
         <w:tc>
           <w:tcPr>
-            <w:tcW w:type="dxa" w:w="1900"/>
+            <w:tcW w:type="dxa" w:w="1409"/>
             <w:tcMar>
               <w:top w:type="dxa" w:w="30"/>
               <w:left w:type="dxa" w:w="100"/>
@@ -3848,7 +3848,7 @@
     </w:p>
     <w:tbl>
       <w:tblPr>
-        <w:tblW w:type="dxa" w:w="7200"/>
+        <w:tblW w:type="dxa" w:w="6900"/>
         <w:tblBorders>
           <w:top w:val="single" w:color="auto" w:sz="4"/>
           <w:left w:val="single" w:color="auto" w:sz="4"/>
@@ -3859,14 +3859,14 @@
         </w:tblBorders>
       </w:tblPr>
       <w:tblGrid>
-        <w:gridCol w:w="2400"/>
-        <w:gridCol w:w="2400"/>
-        <w:gridCol w:w="2400"/>
+        <w:gridCol w:w="2300"/>
+        <w:gridCol w:w="2300"/>
+        <w:gridCol w:w="2300"/>
       </w:tblGrid>
       <w:tr>
         <w:tc>
           <w:tcPr>
-            <w:tcW w:type="dxa" w:w="2400"/>
+            <w:tcW w:type="dxa" w:w="2300"/>
             <w:shd w:fill="E8ECF5" w:val="clear"/>
             <w:tcMar>
               <w:top w:type="dxa" w:w="30"/>
@@ -3893,7 +3893,7 @@
         </w:tc>
         <w:tc>
           <w:tcPr>
-            <w:tcW w:type="dxa" w:w="2400"/>
+            <w:tcW w:type="dxa" w:w="2300"/>
             <w:shd w:fill="E8ECF5" w:val="clear"/>
             <w:tcMar>
               <w:top w:type="dxa" w:w="30"/>
@@ -3920,7 +3920,7 @@
         </w:tc>
         <w:tc>
           <w:tcPr>
-            <w:tcW w:type="dxa" w:w="2400"/>
+            <w:tcW w:type="dxa" w:w="2300"/>
             <w:shd w:fill="E8ECF5" w:val="clear"/>
             <w:tcMar>
               <w:top w:type="dxa" w:w="30"/>
@@ -3949,7 +3949,7 @@
       <w:tr>
         <w:tc>
           <w:tcPr>
-            <w:tcW w:type="dxa" w:w="2400"/>
+            <w:tcW w:type="dxa" w:w="2300"/>
             <w:tcMar>
               <w:top w:type="dxa" w:w="30"/>
               <w:left w:type="dxa" w:w="100"/>
@@ -3975,7 +3975,7 @@
         </w:tc>
         <w:tc>
           <w:tcPr>
-            <w:tcW w:type="dxa" w:w="2400"/>
+            <w:tcW w:type="dxa" w:w="2300"/>
             <w:tcMar>
               <w:top w:type="dxa" w:w="30"/>
               <w:left w:type="dxa" w:w="100"/>
@@ -4001,7 +4001,7 @@
         </w:tc>
         <w:tc>
           <w:tcPr>
-            <w:tcW w:type="dxa" w:w="2400"/>
+            <w:tcW w:type="dxa" w:w="2300"/>
             <w:tcMar>
               <w:top w:type="dxa" w:w="30"/>
               <w:left w:type="dxa" w:w="100"/>
@@ -4029,7 +4029,7 @@
       <w:tr>
         <w:tc>
           <w:tcPr>
-            <w:tcW w:type="dxa" w:w="2400"/>
+            <w:tcW w:type="dxa" w:w="2300"/>
             <w:tcMar>
               <w:top w:type="dxa" w:w="30"/>
               <w:left w:type="dxa" w:w="100"/>
@@ -4055,7 +4055,7 @@
         </w:tc>
         <w:tc>
           <w:tcPr>
-            <w:tcW w:type="dxa" w:w="2400"/>
+            <w:tcW w:type="dxa" w:w="2300"/>
             <w:tcMar>
               <w:top w:type="dxa" w:w="30"/>
               <w:left w:type="dxa" w:w="100"/>
@@ -4081,7 +4081,7 @@
         </w:tc>
         <w:tc>
           <w:tcPr>
-            <w:tcW w:type="dxa" w:w="2400"/>
+            <w:tcW w:type="dxa" w:w="2300"/>
             <w:tcMar>
               <w:top w:type="dxa" w:w="30"/>
               <w:left w:type="dxa" w:w="100"/>
@@ -4109,7 +4109,7 @@
       <w:tr>
         <w:tc>
           <w:tcPr>
-            <w:tcW w:type="dxa" w:w="2400"/>
+            <w:tcW w:type="dxa" w:w="2300"/>
             <w:tcMar>
               <w:top w:type="dxa" w:w="30"/>
               <w:left w:type="dxa" w:w="100"/>
@@ -4135,7 +4135,7 @@
         </w:tc>
         <w:tc>
           <w:tcPr>
-            <w:tcW w:type="dxa" w:w="2400"/>
+            <w:tcW w:type="dxa" w:w="2300"/>
             <w:tcMar>
               <w:top w:type="dxa" w:w="30"/>
               <w:left w:type="dxa" w:w="100"/>
@@ -4161,7 +4161,7 @@
         </w:tc>
         <w:tc>
           <w:tcPr>
-            <w:tcW w:type="dxa" w:w="2400"/>
+            <w:tcW w:type="dxa" w:w="2300"/>
             <w:tcMar>
               <w:top w:type="dxa" w:w="30"/>
               <w:left w:type="dxa" w:w="100"/>
@@ -4189,7 +4189,7 @@
       <w:tr>
         <w:tc>
           <w:tcPr>
-            <w:tcW w:type="dxa" w:w="2400"/>
+            <w:tcW w:type="dxa" w:w="2300"/>
             <w:tcMar>
               <w:top w:type="dxa" w:w="30"/>
               <w:left w:type="dxa" w:w="100"/>
@@ -4215,7 +4215,7 @@
         </w:tc>
         <w:tc>
           <w:tcPr>
-            <w:tcW w:type="dxa" w:w="2400"/>
+            <w:tcW w:type="dxa" w:w="2300"/>
             <w:tcMar>
               <w:top w:type="dxa" w:w="30"/>
               <w:left w:type="dxa" w:w="100"/>
@@ -4241,7 +4241,7 @@
         </w:tc>
         <w:tc>
           <w:tcPr>
-            <w:tcW w:type="dxa" w:w="2400"/>
+            <w:tcW w:type="dxa" w:w="2300"/>
             <w:tcMar>
               <w:top w:type="dxa" w:w="30"/>
               <w:left w:type="dxa" w:w="100"/>
@@ -4269,7 +4269,7 @@
       <w:tr>
         <w:tc>
           <w:tcPr>
-            <w:tcW w:type="dxa" w:w="2400"/>
+            <w:tcW w:type="dxa" w:w="2300"/>
             <w:tcMar>
               <w:top w:type="dxa" w:w="30"/>
               <w:left w:type="dxa" w:w="100"/>
@@ -4295,7 +4295,7 @@
         </w:tc>
         <w:tc>
           <w:tcPr>
-            <w:tcW w:type="dxa" w:w="2400"/>
+            <w:tcW w:type="dxa" w:w="2300"/>
             <w:tcMar>
               <w:top w:type="dxa" w:w="30"/>
               <w:left w:type="dxa" w:w="100"/>
@@ -4321,7 +4321,7 @@
         </w:tc>
         <w:tc>
           <w:tcPr>
-            <w:tcW w:type="dxa" w:w="2400"/>
+            <w:tcW w:type="dxa" w:w="2300"/>
             <w:tcMar>
               <w:top w:type="dxa" w:w="30"/>
               <w:left w:type="dxa" w:w="100"/>
@@ -4349,7 +4349,7 @@
       <w:tr>
         <w:tc>
           <w:tcPr>
-            <w:tcW w:type="dxa" w:w="2400"/>
+            <w:tcW w:type="dxa" w:w="2300"/>
             <w:tcMar>
               <w:top w:type="dxa" w:w="30"/>
               <w:left w:type="dxa" w:w="100"/>
@@ -4375,7 +4375,7 @@
         </w:tc>
         <w:tc>
           <w:tcPr>
-            <w:tcW w:type="dxa" w:w="2400"/>
+            <w:tcW w:type="dxa" w:w="2300"/>
             <w:tcMar>
               <w:top w:type="dxa" w:w="30"/>
               <w:left w:type="dxa" w:w="100"/>
@@ -4401,7 +4401,7 @@
         </w:tc>
         <w:tc>
           <w:tcPr>
-            <w:tcW w:type="dxa" w:w="2400"/>
+            <w:tcW w:type="dxa" w:w="2300"/>
             <w:tcMar>
               <w:top w:type="dxa" w:w="30"/>
               <w:left w:type="dxa" w:w="100"/>
@@ -4458,7 +4458,7 @@
     </w:p>
     <w:tbl>
       <w:tblPr>
-        <w:tblW w:type="dxa" w:w="8600"/>
+        <w:tblW w:type="dxa" w:w="6899"/>
         <w:tblBorders>
           <w:top w:val="single" w:color="auto" w:sz="4"/>
           <w:left w:val="single" w:color="auto" w:sz="4"/>
@@ -4469,14 +4469,14 @@
         </w:tblBorders>
       </w:tblPr>
       <w:tblGrid>
-        <w:gridCol w:w="1400"/>
-        <w:gridCol w:w="5400"/>
-        <w:gridCol w:w="1800"/>
+        <w:gridCol w:w="1123"/>
+        <w:gridCol w:w="4332"/>
+        <w:gridCol w:w="1444"/>
       </w:tblGrid>
       <w:tr>
         <w:tc>
           <w:tcPr>
-            <w:tcW w:type="dxa" w:w="1400"/>
+            <w:tcW w:type="dxa" w:w="1123"/>
             <w:shd w:fill="E8ECF5" w:val="clear"/>
             <w:tcMar>
               <w:top w:type="dxa" w:w="30"/>
@@ -4503,7 +4503,7 @@
         </w:tc>
         <w:tc>
           <w:tcPr>
-            <w:tcW w:type="dxa" w:w="5400"/>
+            <w:tcW w:type="dxa" w:w="4332"/>
             <w:shd w:fill="E8ECF5" w:val="clear"/>
             <w:tcMar>
               <w:top w:type="dxa" w:w="30"/>
@@ -4530,7 +4530,7 @@
         </w:tc>
         <w:tc>
           <w:tcPr>
-            <w:tcW w:type="dxa" w:w="1800"/>
+            <w:tcW w:type="dxa" w:w="1444"/>
             <w:shd w:fill="E8ECF5" w:val="clear"/>
             <w:tcMar>
               <w:top w:type="dxa" w:w="30"/>
@@ -4559,7 +4559,7 @@
       <w:tr>
         <w:tc>
           <w:tcPr>
-            <w:tcW w:type="dxa" w:w="1400"/>
+            <w:tcW w:type="dxa" w:w="1123"/>
             <w:tcMar>
               <w:top w:type="dxa" w:w="30"/>
               <w:left w:type="dxa" w:w="100"/>
@@ -4585,7 +4585,7 @@
         </w:tc>
         <w:tc>
           <w:tcPr>
-            <w:tcW w:type="dxa" w:w="5400"/>
+            <w:tcW w:type="dxa" w:w="4332"/>
             <w:tcMar>
               <w:top w:type="dxa" w:w="30"/>
               <w:left w:type="dxa" w:w="100"/>
@@ -4611,7 +4611,7 @@
         </w:tc>
         <w:tc>
           <w:tcPr>
-            <w:tcW w:type="dxa" w:w="1800"/>
+            <w:tcW w:type="dxa" w:w="1444"/>
             <w:tcMar>
               <w:top w:type="dxa" w:w="30"/>
               <w:left w:type="dxa" w:w="100"/>
@@ -4639,7 +4639,7 @@
       <w:tr>
         <w:tc>
           <w:tcPr>
-            <w:tcW w:type="dxa" w:w="1400"/>
+            <w:tcW w:type="dxa" w:w="1123"/>
             <w:tcMar>
               <w:top w:type="dxa" w:w="30"/>
               <w:left w:type="dxa" w:w="100"/>
@@ -4665,7 +4665,7 @@
         </w:tc>
         <w:tc>
           <w:tcPr>
-            <w:tcW w:type="dxa" w:w="5400"/>
+            <w:tcW w:type="dxa" w:w="4332"/>
             <w:tcMar>
               <w:top w:type="dxa" w:w="30"/>
               <w:left w:type="dxa" w:w="100"/>
@@ -4691,7 +4691,7 @@
         </w:tc>
         <w:tc>
           <w:tcPr>
-            <w:tcW w:type="dxa" w:w="1800"/>
+            <w:tcW w:type="dxa" w:w="1444"/>
             <w:tcMar>
               <w:top w:type="dxa" w:w="30"/>
               <w:left w:type="dxa" w:w="100"/>
@@ -4719,7 +4719,7 @@
       <w:tr>
         <w:tc>
           <w:tcPr>
-            <w:tcW w:type="dxa" w:w="1400"/>
+            <w:tcW w:type="dxa" w:w="1123"/>
             <w:tcMar>
               <w:top w:type="dxa" w:w="30"/>
               <w:left w:type="dxa" w:w="100"/>
@@ -4745,7 +4745,7 @@
         </w:tc>
         <w:tc>
           <w:tcPr>
-            <w:tcW w:type="dxa" w:w="5400"/>
+            <w:tcW w:type="dxa" w:w="4332"/>
             <w:tcMar>
               <w:top w:type="dxa" w:w="30"/>
               <w:left w:type="dxa" w:w="100"/>
@@ -4771,7 +4771,7 @@
         </w:tc>
         <w:tc>
           <w:tcPr>
-            <w:tcW w:type="dxa" w:w="1800"/>
+            <w:tcW w:type="dxa" w:w="1444"/>
             <w:tcMar>
               <w:top w:type="dxa" w:w="30"/>
               <w:left w:type="dxa" w:w="100"/>
@@ -4843,7 +4843,7 @@
     </w:p>
     <w:tbl>
       <w:tblPr>
-        <w:tblW w:type="dxa" w:w="7600"/>
+        <w:tblW w:type="dxa" w:w="6900"/>
         <w:tblBorders>
           <w:top w:val="single" w:color="auto" w:sz="4"/>
           <w:left w:val="single" w:color="auto" w:sz="4"/>
@@ -4854,15 +4854,15 @@
         </w:tblBorders>
       </w:tblPr>
       <w:tblGrid>
-        <w:gridCol w:w="2400"/>
-        <w:gridCol w:w="1500"/>
-        <w:gridCol w:w="1800"/>
-        <w:gridCol w:w="1900"/>
+        <w:gridCol w:w="2179"/>
+        <w:gridCol w:w="1362"/>
+        <w:gridCol w:w="1634"/>
+        <w:gridCol w:w="1725"/>
       </w:tblGrid>
       <w:tr>
         <w:tc>
           <w:tcPr>
-            <w:tcW w:type="dxa" w:w="2400"/>
+            <w:tcW w:type="dxa" w:w="2179"/>
             <w:shd w:fill="E8ECF5" w:val="clear"/>
             <w:tcMar>
               <w:top w:type="dxa" w:w="30"/>
@@ -4889,7 +4889,7 @@
         </w:tc>
         <w:tc>
           <w:tcPr>
-            <w:tcW w:type="dxa" w:w="1500"/>
+            <w:tcW w:type="dxa" w:w="1362"/>
             <w:shd w:fill="E8ECF5" w:val="clear"/>
             <w:tcMar>
               <w:top w:type="dxa" w:w="30"/>
@@ -4916,7 +4916,7 @@
         </w:tc>
         <w:tc>
           <w:tcPr>
-            <w:tcW w:type="dxa" w:w="1800"/>
+            <w:tcW w:type="dxa" w:w="1634"/>
             <w:shd w:fill="E8ECF5" w:val="clear"/>
             <w:tcMar>
               <w:top w:type="dxa" w:w="30"/>
@@ -4943,7 +4943,7 @@
         </w:tc>
         <w:tc>
           <w:tcPr>
-            <w:tcW w:type="dxa" w:w="1900"/>
+            <w:tcW w:type="dxa" w:w="1725"/>
             <w:shd w:fill="E8ECF5" w:val="clear"/>
             <w:tcMar>
               <w:top w:type="dxa" w:w="30"/>
@@ -4972,7 +4972,7 @@
       <w:tr>
         <w:tc>
           <w:tcPr>
-            <w:tcW w:type="dxa" w:w="2400"/>
+            <w:tcW w:type="dxa" w:w="2179"/>
             <w:tcMar>
               <w:top w:type="dxa" w:w="30"/>
               <w:left w:type="dxa" w:w="100"/>
@@ -4998,7 +4998,7 @@
         </w:tc>
         <w:tc>
           <w:tcPr>
-            <w:tcW w:type="dxa" w:w="1500"/>
+            <w:tcW w:type="dxa" w:w="1362"/>
             <w:tcMar>
               <w:top w:type="dxa" w:w="30"/>
               <w:left w:type="dxa" w:w="100"/>
@@ -5024,7 +5024,7 @@
         </w:tc>
         <w:tc>
           <w:tcPr>
-            <w:tcW w:type="dxa" w:w="1800"/>
+            <w:tcW w:type="dxa" w:w="1634"/>
             <w:tcMar>
               <w:top w:type="dxa" w:w="30"/>
               <w:left w:type="dxa" w:w="100"/>
@@ -5050,7 +5050,7 @@
         </w:tc>
         <w:tc>
           <w:tcPr>
-            <w:tcW w:type="dxa" w:w="1900"/>
+            <w:tcW w:type="dxa" w:w="1725"/>
             <w:tcMar>
               <w:top w:type="dxa" w:w="30"/>
               <w:left w:type="dxa" w:w="100"/>
@@ -5078,7 +5078,7 @@
       <w:tr>
         <w:tc>
           <w:tcPr>
-            <w:tcW w:type="dxa" w:w="2400"/>
+            <w:tcW w:type="dxa" w:w="2179"/>
             <w:tcMar>
               <w:top w:type="dxa" w:w="30"/>
               <w:left w:type="dxa" w:w="100"/>
@@ -5104,7 +5104,7 @@
         </w:tc>
         <w:tc>
           <w:tcPr>
-            <w:tcW w:type="dxa" w:w="1500"/>
+            <w:tcW w:type="dxa" w:w="1362"/>
             <w:tcMar>
               <w:top w:type="dxa" w:w="30"/>
               <w:left w:type="dxa" w:w="100"/>
@@ -5130,7 +5130,7 @@
         </w:tc>
         <w:tc>
           <w:tcPr>
-            <w:tcW w:type="dxa" w:w="1800"/>
+            <w:tcW w:type="dxa" w:w="1634"/>
             <w:tcMar>
               <w:top w:type="dxa" w:w="30"/>
               <w:left w:type="dxa" w:w="100"/>
@@ -5156,7 +5156,7 @@
         </w:tc>
         <w:tc>
           <w:tcPr>
-            <w:tcW w:type="dxa" w:w="1900"/>
+            <w:tcW w:type="dxa" w:w="1725"/>
             <w:tcMar>
               <w:top w:type="dxa" w:w="30"/>
               <w:left w:type="dxa" w:w="100"/>
@@ -5184,7 +5184,7 @@
       <w:tr>
         <w:tc>
           <w:tcPr>
-            <w:tcW w:type="dxa" w:w="2400"/>
+            <w:tcW w:type="dxa" w:w="2179"/>
             <w:tcMar>
               <w:top w:type="dxa" w:w="30"/>
               <w:left w:type="dxa" w:w="100"/>
@@ -5210,7 +5210,7 @@
         </w:tc>
         <w:tc>
           <w:tcPr>
-            <w:tcW w:type="dxa" w:w="1500"/>
+            <w:tcW w:type="dxa" w:w="1362"/>
             <w:tcMar>
               <w:top w:type="dxa" w:w="30"/>
               <w:left w:type="dxa" w:w="100"/>
@@ -5236,7 +5236,7 @@
         </w:tc>
         <w:tc>
           <w:tcPr>
-            <w:tcW w:type="dxa" w:w="1800"/>
+            <w:tcW w:type="dxa" w:w="1634"/>
             <w:tcMar>
               <w:top w:type="dxa" w:w="30"/>
               <w:left w:type="dxa" w:w="100"/>
@@ -5262,7 +5262,7 @@
         </w:tc>
         <w:tc>
           <w:tcPr>
-            <w:tcW w:type="dxa" w:w="1900"/>
+            <w:tcW w:type="dxa" w:w="1725"/>
             <w:tcMar>
               <w:top w:type="dxa" w:w="30"/>
               <w:left w:type="dxa" w:w="100"/>
@@ -5290,7 +5290,7 @@
       <w:tr>
         <w:tc>
           <w:tcPr>
-            <w:tcW w:type="dxa" w:w="2400"/>
+            <w:tcW w:type="dxa" w:w="2179"/>
             <w:tcMar>
               <w:top w:type="dxa" w:w="30"/>
               <w:left w:type="dxa" w:w="100"/>
@@ -5316,7 +5316,7 @@
         </w:tc>
         <w:tc>
           <w:tcPr>
-            <w:tcW w:type="dxa" w:w="1500"/>
+            <w:tcW w:type="dxa" w:w="1362"/>
             <w:tcMar>
               <w:top w:type="dxa" w:w="30"/>
               <w:left w:type="dxa" w:w="100"/>
@@ -5342,7 +5342,7 @@
         </w:tc>
         <w:tc>
           <w:tcPr>
-            <w:tcW w:type="dxa" w:w="1800"/>
+            <w:tcW w:type="dxa" w:w="1634"/>
             <w:tcMar>
               <w:top w:type="dxa" w:w="30"/>
               <w:left w:type="dxa" w:w="100"/>
@@ -5368,7 +5368,7 @@
         </w:tc>
         <w:tc>
           <w:tcPr>
-            <w:tcW w:type="dxa" w:w="1900"/>
+            <w:tcW w:type="dxa" w:w="1725"/>
             <w:tcMar>
               <w:top w:type="dxa" w:w="30"/>
               <w:left w:type="dxa" w:w="100"/>
@@ -5396,7 +5396,7 @@
       <w:tr>
         <w:tc>
           <w:tcPr>
-            <w:tcW w:type="dxa" w:w="2400"/>
+            <w:tcW w:type="dxa" w:w="2179"/>
             <w:tcMar>
               <w:top w:type="dxa" w:w="30"/>
               <w:left w:type="dxa" w:w="100"/>
@@ -5422,7 +5422,7 @@
         </w:tc>
         <w:tc>
           <w:tcPr>
-            <w:tcW w:type="dxa" w:w="1500"/>
+            <w:tcW w:type="dxa" w:w="1362"/>
             <w:tcMar>
               <w:top w:type="dxa" w:w="30"/>
               <w:left w:type="dxa" w:w="100"/>
@@ -5448,7 +5448,7 @@
         </w:tc>
         <w:tc>
           <w:tcPr>
-            <w:tcW w:type="dxa" w:w="1800"/>
+            <w:tcW w:type="dxa" w:w="1634"/>
             <w:tcMar>
               <w:top w:type="dxa" w:w="30"/>
               <w:left w:type="dxa" w:w="100"/>
@@ -5474,7 +5474,7 @@
         </w:tc>
         <w:tc>
           <w:tcPr>
-            <w:tcW w:type="dxa" w:w="1900"/>
+            <w:tcW w:type="dxa" w:w="1725"/>
             <w:tcMar>
               <w:top w:type="dxa" w:w="30"/>
               <w:left w:type="dxa" w:w="100"/>
@@ -5502,7 +5502,7 @@
       <w:tr>
         <w:tc>
           <w:tcPr>
-            <w:tcW w:type="dxa" w:w="2400"/>
+            <w:tcW w:type="dxa" w:w="2179"/>
             <w:tcMar>
               <w:top w:type="dxa" w:w="30"/>
               <w:left w:type="dxa" w:w="100"/>
@@ -5528,7 +5528,7 @@
         </w:tc>
         <w:tc>
           <w:tcPr>
-            <w:tcW w:type="dxa" w:w="1500"/>
+            <w:tcW w:type="dxa" w:w="1362"/>
             <w:tcMar>
               <w:top w:type="dxa" w:w="30"/>
               <w:left w:type="dxa" w:w="100"/>
@@ -5554,7 +5554,7 @@
         </w:tc>
         <w:tc>
           <w:tcPr>
-            <w:tcW w:type="dxa" w:w="1800"/>
+            <w:tcW w:type="dxa" w:w="1634"/>
             <w:tcMar>
               <w:top w:type="dxa" w:w="30"/>
               <w:left w:type="dxa" w:w="100"/>
@@ -5580,7 +5580,7 @@
         </w:tc>
         <w:tc>
           <w:tcPr>
-            <w:tcW w:type="dxa" w:w="1900"/>
+            <w:tcW w:type="dxa" w:w="1725"/>
             <w:tcMar>
               <w:top w:type="dxa" w:w="30"/>
               <w:left w:type="dxa" w:w="100"/>
@@ -5608,7 +5608,7 @@
       <w:tr>
         <w:tc>
           <w:tcPr>
-            <w:tcW w:type="dxa" w:w="2400"/>
+            <w:tcW w:type="dxa" w:w="2179"/>
             <w:tcMar>
               <w:top w:type="dxa" w:w="30"/>
               <w:left w:type="dxa" w:w="100"/>
@@ -5634,7 +5634,7 @@
         </w:tc>
         <w:tc>
           <w:tcPr>
-            <w:tcW w:type="dxa" w:w="1500"/>
+            <w:tcW w:type="dxa" w:w="1362"/>
             <w:tcMar>
               <w:top w:type="dxa" w:w="30"/>
               <w:left w:type="dxa" w:w="100"/>
@@ -5660,7 +5660,7 @@
         </w:tc>
         <w:tc>
           <w:tcPr>
-            <w:tcW w:type="dxa" w:w="1800"/>
+            <w:tcW w:type="dxa" w:w="1634"/>
             <w:tcMar>
               <w:top w:type="dxa" w:w="30"/>
               <w:left w:type="dxa" w:w="100"/>
@@ -5686,7 +5686,7 @@
         </w:tc>
         <w:tc>
           <w:tcPr>
-            <w:tcW w:type="dxa" w:w="1900"/>
+            <w:tcW w:type="dxa" w:w="1725"/>
             <w:tcMar>
               <w:top w:type="dxa" w:w="30"/>
               <w:left w:type="dxa" w:w="100"/>
@@ -5714,7 +5714,7 @@
       <w:tr>
         <w:tc>
           <w:tcPr>
-            <w:tcW w:type="dxa" w:w="2400"/>
+            <w:tcW w:type="dxa" w:w="2179"/>
             <w:tcMar>
               <w:top w:type="dxa" w:w="30"/>
               <w:left w:type="dxa" w:w="100"/>
@@ -5740,7 +5740,7 @@
         </w:tc>
         <w:tc>
           <w:tcPr>
-            <w:tcW w:type="dxa" w:w="1500"/>
+            <w:tcW w:type="dxa" w:w="1362"/>
             <w:tcMar>
               <w:top w:type="dxa" w:w="30"/>
               <w:left w:type="dxa" w:w="100"/>
@@ -5766,7 +5766,7 @@
         </w:tc>
         <w:tc>
           <w:tcPr>
-            <w:tcW w:type="dxa" w:w="1800"/>
+            <w:tcW w:type="dxa" w:w="1634"/>
             <w:tcMar>
               <w:top w:type="dxa" w:w="30"/>
               <w:left w:type="dxa" w:w="100"/>
@@ -5792,7 +5792,7 @@
         </w:tc>
         <w:tc>
           <w:tcPr>
-            <w:tcW w:type="dxa" w:w="1900"/>
+            <w:tcW w:type="dxa" w:w="1725"/>
             <w:tcMar>
               <w:top w:type="dxa" w:w="30"/>
               <w:left w:type="dxa" w:w="100"/>

</xml_diff>

<commit_message>
Conference paper: add R1-R39 training-history bar chart and R39 epoch-convergence chart
New Fig. 2 (Section 9.1, right after the ablation-runs discussion/Table
4): a compact two-panel figure -- (a) mean/best AUC across all 39
tracked training runs with R39 highlighted, (b) R39's five-fold
validation-AUC convergence curves with per-fold test AUC in the
legend. Built as a small, light/print-themed chart (not the deck's
dark theme) sized to stay unobtrusive at the paper's column width.

Same figure added to .doc/.docx and .tex. Tightened a few paragraphs
and the reference-list spacing to hold the page count at 12 after the
new figure+caption.

Co-Authored-By: Claude Sonnet 5 <noreply@anthropic.com>
</commit_message>
<xml_diff>
--- a/Review_files/Conference paper submission/ParthasarathyPerumal_fullpaper.docx
+++ b/Review_files/Conference paper submission/ParthasarathyPerumal_fullpaper.docx
@@ -78,7 +78,7 @@
         </w:rPr>
         <w:t xml:space="preserve">Corresponding author(s). E-mail(s): </w:t>
       </w:r>
-      <w:hyperlink w:history="1" r:id="rIdckrmcdov0liyotmy-levr">
+      <w:hyperlink w:history="1" r:id="rIdpacf4k9qppodwziyibw4i">
         <w:r>
           <w:rPr>
             <w:rStyle w:val="Hyperlink"/>
@@ -180,7 +180,7 @@
           <w:sz w:val="20"/>
           <w:szCs w:val="20"/>
         </w:rPr>
-        <w:t xml:space="preserve">Assembling a mechanical design in a modern CAD package — SolidWorks, CATIA, Fusion 360 — is still a manual, expert-driven process. The software tracks geometry and mating constraints faithfully, but it offers no judgement about the assembly itself: it cannot tell a designer that a bolted joint is missing its nut, that a valve housing typically pairs with a particular gland-plate variant, or what shape a plausible replacement part should take. That judgement lives entirely in the designer's experience. For junior engineers, or for anyone auditing a partially-defined assembly inherited from someone else, this is a real productivity and quality gap: incomplete assemblies have no built-in mechanism to flag what is missing, and no standardised way to suggest what should be added.</w:t>
+        <w:t xml:space="preserve">Assembling a mechanical design in a modern CAD package — SolidWorks, CATIA, Fusion 360 — is still a manual, expert-driven process. The software tracks geometry and mating constraints faithfully, but offers no judgement about the assembly itself: it cannot tell a designer that a bolted joint is missing its nut, or what shape a plausible replacement part should take. That judgement lives entirely in the designer's experience. For junior engineers, or anyone auditing an assembly inherited from someone else, this is a real gap: incomplete assemblies have no built-in mechanism to flag what is missing.</w:t>
       </w:r>
     </w:p>
     <w:p>
@@ -195,7 +195,7 @@
           <w:sz w:val="20"/>
           <w:szCs w:val="20"/>
         </w:rPr>
-        <w:t xml:space="preserve">This gap is a natural fit for graph-based deep learning. A rigid mechanical assembly is, structurally, a graph: solid bodies are nodes, and physical contact between two bodies — a bolt seated in a hole, a shaft running through a bushing — is an edge. Graph neural networks (GNNs) are designed to learn representations over exactly this kind of relational structure, and have driven substantial recent progress in adjacent CAD-generation tasks such as boundary-representation (B-Rep) synthesis </w:t>
+        <w:t xml:space="preserve">This gap is a natural fit for graph-based deep learning. A rigid mechanical assembly is, structurally, a graph: solid bodies are nodes, and physical contact between two bodies is an edge. Graph neural networks (GNNs) are designed to learn representations over exactly this kind of relational structure, and have driven substantial recent progress in adjacent CAD-generation tasks such as boundary-representation (B-Rep) synthesis </w:t>
       </w:r>
       <w:r>
         <w:rPr>
@@ -2498,7 +2498,7 @@
           <w:sz w:val="20"/>
           <w:szCs w:val="20"/>
         </w:rPr>
-        <w:t xml:space="preserve">Building a pipeline that runs end-to-end on real, imperfect STEP geometry surfaced several infrastructure-level problems with no direct analogue in a purely algorithmic description of the system. We report the ones with the largest measured impact, both because they were non-obvious in advance and because several of them materially affected reported results.</w:t>
+        <w:t xml:space="preserve">Building a pipeline that runs end-to-end on real, imperfect STEP geometry surfaced infrastructure-level problems with no analogue in a purely algorithmic description. We report the ones with the largest measured impact.</w:t>
       </w:r>
     </w:p>
     <w:p>
@@ -2573,7 +2573,7 @@
           <w:sz w:val="20"/>
           <w:szCs w:val="20"/>
         </w:rPr>
-        <w:t xml:space="preserve">The checkpoint-promotion gate compared metrics as a lexicographic tuple; Python's short-circuit comparison silently ignored average precision whenever two candidates tied on AUC-ROC, letting a regression on the second metric through undetected. The gate now requires both metrics to improve.</w:t>
+        <w:t xml:space="preserve">The checkpoint-promotion gate compared metrics as a lexicographic tuple; a short-circuit comparison silently ignored average precision whenever candidates tied on AUC-ROC. The gate now requires both metrics to improve.</w:t>
       </w:r>
     </w:p>
     <w:p>
@@ -2658,7 +2658,7 @@
           <w:sz w:val="20"/>
           <w:szCs w:val="20"/>
         </w:rPr>
-        <w:t xml:space="preserve">The training corpus consists of 749 STEP-format assembly models, curated evenly across seven mechanical-part categories relevant to industrial fastening and flow-control mechanisms — bench vices, C-clamps, pipe vices, gate valves, press tools, tool posts, and crane hooks — 107 models per category. After parsing through the gmsh/OpenCASCADE pipeline, 648 of the 749 models (86.5%) yielded usable graphs; the remainder failed under a bounded-timeout parsing policy, disproportionately concentrated in the gate-valve category (51.4% yield versus 82–99% for the other six), which also has this corpus's largest mean graph size (93.9 bodies per assembly against an overall mean of 38.8), suggesting geometric complexity as the likely common cause. The resulting 648 graphs contain 25,155 labelled bodies and 46,767 undirected contact edges in total. Table 2 summarises the per-category composition.</w:t>
+        <w:t xml:space="preserve">The training corpus consists of 749 STEP-format assembly models, curated evenly across seven mechanical-part categories relevant to industrial fastening and flow-control mechanisms — bench vices, C-clamps, pipe vices, gate valves, press tools, tool posts, and crane hooks — 107 models per category. After parsing through the gmsh/OpenCASCADE pipeline, 648 of the 749 models (86.5%) yielded usable graphs; the remainder failed under a bounded-timeout parsing policy, disproportionately concentrated in gate-valve (51.4% yield versus 82–99% for the other six), which also has the largest mean graph size (93.9 bodies/assembly vs. an overall mean of 38.8) — suggesting geometric complexity as the cause. The resulting graphs contain 25,155 labelled bodies and 46,767 undirected contact edges. Table 2 summarises the per-category composition.</w:t>
       </w:r>
     </w:p>
     <w:tbl>
@@ -4813,6 +4813,66 @@
     </w:p>
     <w:p>
       <w:pPr>
+        <w:spacing w:after="40" w:before="60"/>
+        <w:jc w:val="center"/>
+      </w:pPr>
+      <w:r>
+        <w:drawing>
+          <wp:inline distT="0" distB="0" distL="0" distR="0">
+            <wp:extent cx="3952875" cy="1076325"/>
+            <wp:effectExtent t="0" r="0" b="0" l="0"/>
+            <wp:docPr id="1" name="" descr="" title=""/>
+            <wp:cNvGraphicFramePr>
+              <a:graphicFrameLocks xmlns:a="http://schemas.openxmlformats.org/drawingml/2006/main" noChangeAspect="1"/>
+            </wp:cNvGraphicFramePr>
+            <a:graphic xmlns:a="http://schemas.openxmlformats.org/drawingml/2006/main">
+              <a:graphicData uri="http://schemas.openxmlformats.org/drawingml/2006/picture">
+                <pic:pic xmlns:pic="http://schemas.openxmlformats.org/drawingml/2006/picture">
+                  <pic:nvPicPr>
+                    <pic:cNvPr id="0" name="" descr=""/>
+                    <pic:cNvPicPr>
+                      <a:picLocks noChangeAspect="1" noChangeArrowheads="1"/>
+                    </pic:cNvPicPr>
+                  </pic:nvPicPr>
+                  <pic:blipFill>
+                    <a:blip r:embed="rId8" cstate="none"/>
+                    <a:srcRect/>
+                    <a:stretch>
+                      <a:fillRect/>
+                    </a:stretch>
+                  </pic:blipFill>
+                  <pic:spPr bwMode="auto">
+                    <a:xfrm>
+                      <a:off x="0" y="0"/>
+                      <a:ext cx="3952875" cy="1076325"/>
+                    </a:xfrm>
+                    <a:prstGeom prst="rect">
+                      <a:avLst/>
+                    </a:prstGeom>
+                  </pic:spPr>
+                </pic:pic>
+              </a:graphicData>
+            </a:graphic>
+          </wp:inline>
+        </w:drawing>
+      </w:r>
+    </w:p>
+    <w:p>
+      <w:pPr>
+        <w:spacing w:after="200" w:before="120"/>
+        <w:jc w:val="center"/>
+      </w:pPr>
+      <w:r>
+        <w:rPr>
+          <w:rFonts w:ascii="Times New Roman" w:cs="Times New Roman" w:eastAsia="Times New Roman" w:hAnsi="Times New Roman"/>
+          <w:sz w:val="18"/>
+          <w:szCs w:val="18"/>
+        </w:rPr>
+        <w:t xml:space="preserve">Fig. 2. (a) Mean/best AUC across all 39 tracked training runs, R39 (749-model corpus) highlighted. (b) R39's five-fold validation-AUC convergence, final test AUC per fold in the legend.</w:t>
+      </w:r>
+    </w:p>
+    <w:p>
+      <w:pPr>
         <w:spacing w:after="60" w:before="120"/>
       </w:pPr>
       <w:r>
@@ -5874,7 +5934,7 @@
           <w:sz w:val="20"/>
           <w:szCs w:val="20"/>
         </w:rPr>
-        <w:t xml:space="preserve">A full exploratory pass over the final 648-graph corpus, run after training had already completed successfully, surfaced an issue invisible to the training metrics themselves: the SDF-mean node feature (Section 3.1) is exactly zero for 25,142 of 25,155 bodies (99.95%); only 13 bodies carry a non-zero value, and the paired SDF-variance feature moves in near-perfect lockstep (r &gt; 0.999) — consistent with a silently constant feature rather than genuinely near-zero geometry. This mirrors an earlier instance where hole-count and joint-type features were found silently zero-valued since the project's inception; fixing that produced the largest single-run gain of the project (Table 4). We report the SDF finding unresolved rather than omit it: strong aggregate metrics are not sufficient evidence every input feature is contributing, and targeted corpus auditing remains necessary even after training succeeds.</w:t>
+        <w:t xml:space="preserve">A full exploratory pass over the final 648-graph corpus, run after training had already completed successfully, surfaced an issue invisible to the training metrics: the SDF-mean node feature (Section 3.1) is exactly zero for 25,142 of 25,155 bodies (99.95%), and the paired SDF-variance moves in near-perfect lockstep (r &gt; 0.999) — a silently constant feature, not genuinely near-zero geometry. This mirrors an earlier case where hole-count and joint-type were found silently zero-valued since the project's inception; fixing that produced the largest single-run gain of the project (Table 4). We report the SDF finding unresolved rather than omit it: strong aggregate metrics don't guarantee every input feature is contributing.</w:t>
       </w:r>
     </w:p>
     <w:p>
@@ -5919,7 +5979,7 @@
           <w:sz w:val="20"/>
           <w:szCs w:val="20"/>
         </w:rPr>
-        <w:t xml:space="preserve">Three limitations are worth stating plainly. First, NodeRanker's majority-class bias (Section 9.2) means Hit@1, while a genuine improvement over baseline, is unevenly distributed across types; class-balanced sampling or loss re-weighting is the natural next step. Second, the conditional-VAE fallback is currently scoped to fasteners only; broadening it to plates and shafts is future work, alongside re-running the retrieval-threshold analysis, since the current zero-fallback result (Section 9.2) may not hold once non-fastener types are added. Third, the SDF and hole-detection findings (Section 9.3) are open issues: repairing the SDF ray-cast and auditing the bolt/washer false-positive rate against ground-truth geometry are near-term priorities before the next retrain. More broadly, the corpus is domain-specific to fastening and flow-control mechanisms; extending coverage to a wider range of assembly types is a natural direction for generalising these results.</w:t>
+        <w:t xml:space="preserve">Three limitations are worth stating plainly. First, NodeRanker's majority-class bias (Section 9.2) means Hit@1, while a genuine improvement, is unevenly distributed across types; class-balanced sampling is the natural next step. Second, the conditional-VAE fallback is scoped to fasteners only; broadening it to plates and shafts is future work, since the zero-fallback result may not hold once non-fastener types are added. Third, the SDF and hole-detection findings (Section 9.3) are open issues, priorities before the next retrain. More broadly, the corpus is domain-specific to fastening and flow-control mechanisms; broader assembly-type coverage is a natural direction for generalising these results.</w:t>
       </w:r>
     </w:p>
     <w:p>
@@ -6019,7 +6079,7 @@
     </w:p>
     <w:p>
       <w:pPr>
-        <w:spacing w:after="40"/>
+        <w:spacing w:after="20"/>
         <w:ind w:left="340" w:hanging="340"/>
         <w:jc w:val="both"/>
       </w:pPr>
@@ -6044,7 +6104,7 @@
     </w:p>
     <w:p>
       <w:pPr>
-        <w:spacing w:after="40"/>
+        <w:spacing w:after="20"/>
         <w:ind w:left="340" w:hanging="340"/>
         <w:jc w:val="both"/>
       </w:pPr>
@@ -6069,7 +6129,7 @@
     </w:p>
     <w:p>
       <w:pPr>
-        <w:spacing w:after="40"/>
+        <w:spacing w:after="20"/>
         <w:ind w:left="340" w:hanging="340"/>
         <w:jc w:val="both"/>
       </w:pPr>
@@ -6094,7 +6154,7 @@
     </w:p>
     <w:p>
       <w:pPr>
-        <w:spacing w:after="40"/>
+        <w:spacing w:after="20"/>
         <w:ind w:left="340" w:hanging="340"/>
         <w:jc w:val="both"/>
       </w:pPr>
@@ -6119,7 +6179,7 @@
     </w:p>
     <w:p>
       <w:pPr>
-        <w:spacing w:after="40"/>
+        <w:spacing w:after="20"/>
         <w:ind w:left="340" w:hanging="340"/>
         <w:jc w:val="both"/>
       </w:pPr>
@@ -6144,7 +6204,7 @@
     </w:p>
     <w:p>
       <w:pPr>
-        <w:spacing w:after="40"/>
+        <w:spacing w:after="20"/>
         <w:ind w:left="340" w:hanging="340"/>
         <w:jc w:val="both"/>
       </w:pPr>
@@ -6169,7 +6229,7 @@
     </w:p>
     <w:p>
       <w:pPr>
-        <w:spacing w:after="40"/>
+        <w:spacing w:after="20"/>
         <w:ind w:left="340" w:hanging="340"/>
         <w:jc w:val="both"/>
       </w:pPr>
@@ -6194,7 +6254,7 @@
     </w:p>
     <w:p>
       <w:pPr>
-        <w:spacing w:after="40"/>
+        <w:spacing w:after="20"/>
         <w:ind w:left="340" w:hanging="340"/>
         <w:jc w:val="both"/>
       </w:pPr>
@@ -6219,7 +6279,7 @@
     </w:p>
     <w:p>
       <w:pPr>
-        <w:spacing w:after="40"/>
+        <w:spacing w:after="20"/>
         <w:ind w:left="340" w:hanging="340"/>
         <w:jc w:val="both"/>
       </w:pPr>
@@ -6244,7 +6304,7 @@
     </w:p>
     <w:p>
       <w:pPr>
-        <w:spacing w:after="40"/>
+        <w:spacing w:after="20"/>
         <w:ind w:left="340" w:hanging="340"/>
         <w:jc w:val="both"/>
       </w:pPr>
@@ -6269,7 +6329,7 @@
     </w:p>
     <w:p>
       <w:pPr>
-        <w:spacing w:after="40"/>
+        <w:spacing w:after="20"/>
         <w:ind w:left="340" w:hanging="340"/>
         <w:jc w:val="both"/>
       </w:pPr>
@@ -6294,7 +6354,7 @@
     </w:p>
     <w:p>
       <w:pPr>
-        <w:spacing w:after="40"/>
+        <w:spacing w:after="20"/>
         <w:ind w:left="340" w:hanging="340"/>
         <w:jc w:val="both"/>
       </w:pPr>
@@ -6319,7 +6379,7 @@
     </w:p>
     <w:p>
       <w:pPr>
-        <w:spacing w:after="40"/>
+        <w:spacing w:after="20"/>
         <w:ind w:left="340" w:hanging="340"/>
         <w:jc w:val="both"/>
       </w:pPr>
@@ -6344,7 +6404,7 @@
     </w:p>
     <w:p>
       <w:pPr>
-        <w:spacing w:after="40"/>
+        <w:spacing w:after="20"/>
         <w:ind w:left="340" w:hanging="340"/>
         <w:jc w:val="both"/>
       </w:pPr>
@@ -6369,7 +6429,7 @@
     </w:p>
     <w:p>
       <w:pPr>
-        <w:spacing w:after="40"/>
+        <w:spacing w:after="20"/>
         <w:ind w:left="340" w:hanging="340"/>
         <w:jc w:val="both"/>
       </w:pPr>
@@ -6394,7 +6454,7 @@
     </w:p>
     <w:p>
       <w:pPr>
-        <w:spacing w:after="40"/>
+        <w:spacing w:after="20"/>
         <w:ind w:left="340" w:hanging="340"/>
         <w:jc w:val="both"/>
       </w:pPr>
@@ -6419,7 +6479,7 @@
     </w:p>
     <w:p>
       <w:pPr>
-        <w:spacing w:after="40"/>
+        <w:spacing w:after="20"/>
         <w:ind w:left="340" w:hanging="340"/>
         <w:jc w:val="both"/>
       </w:pPr>
@@ -6444,7 +6504,7 @@
     </w:p>
     <w:p>
       <w:pPr>
-        <w:spacing w:after="40"/>
+        <w:spacing w:after="20"/>
         <w:ind w:left="340" w:hanging="340"/>
         <w:jc w:val="both"/>
       </w:pPr>

</xml_diff>

<commit_message>
Conference paper: apply de-AI/plagiarism rewrite across tex, docx, doc and pdf
Applies the user's revised wording (title, abstract, Sections 1-6, and
parts of 8-9) to all four output formats.

Important correction to the supplied rewrite: it had stripped every
in-text citation and dropped the References section entirely, while
still describing BrepGen, SolidGen, CAD-GPT, ABC, PartNet, GNNExplainer,
node2vec, BPR, 3D-R2N2 and the octree watermarking work by name. That
would create uncredited use of ten prior works rather than remove
plagiarism. All 18 citations and the bibliography are restored into the
new wording; verified every bib key is cited and no citation is orphaned.

Also kept the LaTeX math environments rather than the flattened
plain-text equations from the pasted draft.

Word/PDF still 12 pages; docx structural validation passes.

Co-Authored-By: Claude Opus 5 <noreply@anthropic.com>
</commit_message>
<xml_diff>
--- a/Review_files/Conference paper submission/ParthasarathyPerumal_fullpaper.docx
+++ b/Review_files/Conference paper submission/ParthasarathyPerumal_fullpaper.docx
@@ -15,7 +15,7 @@
           <w:sz w:val="28"/>
           <w:szCs w:val="28"/>
         </w:rPr>
-        <w:t xml:space="preserve">Graph Neural Networks for Missing-Component Detection, Recommendation, and Shape Generation in CAD Assemblies</w:t>
+        <w:t xml:space="preserve">Graph Neural Networks for Detecting Missing Components, Offering Recommendations, and Generating Shapes in CAD Assemblies</w:t>
       </w:r>
     </w:p>
     <w:p>
@@ -78,7 +78,7 @@
         </w:rPr>
         <w:t xml:space="preserve">Corresponding author(s). E-mail(s): </w:t>
       </w:r>
-      <w:hyperlink w:history="1" r:id="rIdpacf4k9qppodwziyibw4i">
+      <w:hyperlink w:history="1" r:id="rIdxvpv9kvluldwlg5l1c44p">
         <w:r>
           <w:rPr>
             <w:rStyle w:val="Hyperlink"/>
@@ -127,7 +127,7 @@
           <w:sz w:val="20"/>
           <w:szCs w:val="20"/>
         </w:rPr>
-        <w:t xml:space="preserve">Modern CAD tools offer no contextual intelligence during assembly creation: engineers rely entirely on domain experience to decide which components an assembly still needs and where they belong. We present an end-to-end graph neural network (GNN) system that treats a mechanical assembly as an attributed graph — solid bodies as nodes, real contact surfaces as edges — and addresses assembly completion in two phases. Phase I detects missing components via inductive link prediction over a shared relational-attention encoder (RGATConv). Phase II recommends the most likely next component type through a learned ranking head, then generates an actual placeable 3D shape for it through a hybrid retrieval-plus-conditional-VAE generator, rather than only a text label. Both phases build on a single frozen Phase I encoder, so the marginal cost of each new task head is small. On a curated corpus of 749 CAD assemblies spanning seven machine-part categories (648 usable graphs, 25,155 labelled bodies after parsing), the system reaches a mean link-prediction AUC-ROC of 0.9206 (±0.0121) and mean average precision of 0.9020 across true five-fold cross-validation, a next-component ranking Hit@1 of 0.4093 against a majority-class baseline of 0.3442, and a shape-generation test IoU of 0.6459 with a Chamfer distance of 0.0377. We further contribute a novel Octree-based open-surface detector for locating candidate mating joints without a CAD kernel, an assembly-template frequency prior that works even from a single uploaded body, and an interactive natural-language explanation layer built on GNNExplainer attributions. We report an engineering finding from exploratory analysis of the current corpus — a silently dead shape-descriptor feature affecting 99.95% of bodies — as a reminder that dataset-level auditing remains essential even after a model trains successfully.</w:t>
+        <w:t xml:space="preserve">Modern CAD tools lack contextual intelligence during assembly creation. Engineers must rely entirely on their expertise to determine which components are missing from an assembly and where they should be placed. We introduce a comprehensive graph neural network (GNN) system that views a mechanical assembly as an attributed graph, where solid bodies are nodes and real contact surfaces are edges. This system completes assemblies in two phases. Phase I identifies missing components using inductive link prediction via a shared relational-attention encoder (RGATConv). Phase II recommends the most probable next component type through a learned ranking head and generates its 3D shape using a hybrid retrieval-plus-conditional-VAE generator, rather than just a text label. Both phases utilise a single frozen Phase I encoder, resulting in a minimal additional cost for each new task head. On a curated collection of 749 CAD assemblies covering seven machine-part categories (648 usable graphs and 25,155 labelled bodies after parsing), the system achieves a mean link-prediction AUC-ROC of 0.9206 (±0.0121) and a mean average precision of 0.9020 across true five-fold cross-validation. It also reaches a next-component ranking Hit@1 of 0.4093 against a majority-class baseline of 0.3442 and a shape-generation test IoU of 0.6459 with a Chamfer distance of 0.0377. Additionally, we introduce a novel Octree-based open-surface detector for identifying candidate mating joints without a CAD kernel, an assembly-template frequency prior that can operate from a single uploaded body, and an interactive natural-language explanation layer built on GNNExplainer attributions. We also report an engineering observation from exploratory analysis of the current corpus: a silently inactive shape-descriptor feature impacting 99.95% of bodies, highlighting that dataset-level auditing is crucial even after successful model training.</w:t>
       </w:r>
     </w:p>
     <w:p>
@@ -180,7 +180,7 @@
           <w:sz w:val="20"/>
           <w:szCs w:val="20"/>
         </w:rPr>
-        <w:t xml:space="preserve">Assembling a mechanical design in a modern CAD package — SolidWorks, CATIA, Fusion 360 — is still a manual, expert-driven process. The software tracks geometry and mating constraints faithfully, but offers no judgement about the assembly itself: it cannot tell a designer that a bolted joint is missing its nut, or what shape a plausible replacement part should take. That judgement lives entirely in the designer's experience. For junior engineers, or anyone auditing an assembly inherited from someone else, this is a real gap: incomplete assemblies have no built-in mechanism to flag what is missing.</w:t>
+        <w:t xml:space="preserve">Creating mechanical designs in modern CAD software like SolidWorks, CATIA, and Fusion 360 remains a manual, expert-driven task. These tools accurately track geometry and mating constraints but do not provide insights into the assembly process. They cannot identify missing components like a nut for a bolted joint, or determine what shape a plausible replacement part should take. This knowledge resides solely with the designer. For less experienced engineers, or those auditing an incomplete assembly inherited from another, this presents a real gap: incomplete assemblies lack built-in mechanisms for identifying missing parts.</w:t>
       </w:r>
     </w:p>
     <w:p>
@@ -195,7 +195,7 @@
           <w:sz w:val="20"/>
           <w:szCs w:val="20"/>
         </w:rPr>
-        <w:t xml:space="preserve">This gap is a natural fit for graph-based deep learning. A rigid mechanical assembly is, structurally, a graph: solid bodies are nodes, and physical contact between two bodies is an edge. Graph neural networks (GNNs) are designed to learn representations over exactly this kind of relational structure, and have driven substantial recent progress in adjacent CAD-generation tasks such as boundary-representation (B-Rep) synthesis </w:t>
+        <w:t xml:space="preserve">This gap can be effectively addressed with graph-based deep learning. A mechanical assembly is essentially a graph: solid bodies are nodes, and physical connections between two bodies form the edges. Graph neural networks (GNNs) are designed to learn representations of such relational structures and have driven significant progress in related CAD-generation tasks, such as boundary-representation (B-Rep) synthesis </w:t>
       </w:r>
       <w:r>
         <w:rPr>
@@ -290,7 +290,7 @@
           <w:sz w:val="20"/>
           <w:szCs w:val="20"/>
         </w:rPr>
-        <w:t xml:space="preserve">. Those systems generate whole shapes or whole sequences; comparatively little work targets the narrower, more directly actionable problem this paper addresses: given a partial real assembly, what is missing, what should be added next, and what should it look like.</w:t>
+        <w:t xml:space="preserve">. While these systems generate entire shapes or sequences, there has been less focus on the more specific problem addressed here: identifying what is missing from a partial assembly, what should be added next, and what it should look like.</w:t>
       </w:r>
     </w:p>
     <w:p>
@@ -305,7 +305,7 @@
           <w:sz w:val="20"/>
           <w:szCs w:val="20"/>
         </w:rPr>
-        <w:t xml:space="preserve">Framing assembly completion this way raises two practical requirements. Detection, recommendation, and generation are three different kinds of prediction — an edge score, a categorical ranking, a continuous 3D shape — and training three unrelated models from scratch would triple the data and compute burden for a corpus that, by the standards of large-scale shape datasets </w:t>
+        <w:t xml:space="preserve">Approaching assembly completion in this manner sets two practical requirements. Since detection, recommendation, and generation are three distinct types of predictions — an edge score, a categorical ranking, and a continuous 3D shape — training three separate models from scratch would triple the data and computational burden on a corpus that is modest by large-scale shape dataset standards </w:t>
       </w:r>
       <w:r>
         <w:rPr>
@@ -363,7 +363,7 @@
           <w:sz w:val="20"/>
           <w:szCs w:val="20"/>
         </w:rPr>
-        <w:t xml:space="preserve">, is modest; sharing one encoder across all three tasks is a deliberate response to that constraint. And an incorrect but confident suggestion is arguably worse than none at all in an engineering context, which motivates both the retrieval-first bias in Section 5.2 and the explanation layer in Section 6 — a suggestion the designer cannot audit is one they should not trust.</w:t>
+        <w:t xml:space="preserve">. Sharing one encoder across all three tasks addresses this constraint deliberately. Further, in an engineering context, an incorrect but confident suggestion could be more detrimental than no suggestion, motivating both the retrieval-first bias in Section 5.2 and the explanation layer in Section 6 — a suggestion that cannot be audited by the designer should not be trusted.</w:t>
       </w:r>
     </w:p>
     <w:p>
@@ -378,7 +378,7 @@
           <w:sz w:val="20"/>
           <w:szCs w:val="20"/>
         </w:rPr>
-        <w:t xml:space="preserve">This paper makes the following contributions:</w:t>
+        <w:t xml:space="preserve">This paper contributes the following:</w:t>
       </w:r>
     </w:p>
     <w:p>
@@ -416,7 +416,7 @@
           <w:sz w:val="20"/>
           <w:szCs w:val="20"/>
         </w:rPr>
-        <w:t xml:space="preserve">A hybrid shape generator that prefers real retrieved geometry over a generative fallback, and a corresponding evaluation showing this materially outperforms VAE-only generation on both intersection-over-union and Chamfer distance.</w:t>
+        <w:t xml:space="preserve">A hybrid shape generator that prefers real retrieved geometry over a generative fallback, with corresponding evaluation showing it significantly outperforms VAE-only generation on both intersection-over-union and Chamfer distance.</w:t>
       </w:r>
     </w:p>
     <w:p>
@@ -435,7 +435,7 @@
           <w:sz w:val="20"/>
           <w:szCs w:val="20"/>
         </w:rPr>
-        <w:t xml:space="preserve">Two supporting components with no analogue in the CAD-generation literature we surveyed: an Octree-based open-surface detector that locates candidate joint locations from raw mesh geometry alone, and a per-category component-type frequency prior (AssemblyTemplateDB) that produces a useful completion signal even from a single uploaded body with no graph context at all.</w:t>
+        <w:t xml:space="preserve">Two supporting components without analogues in the CAD-generation literature we reviewed: an Octree-based open-surface detector that identifies candidate joint locations from raw mesh geometry alone, and a per-category component-type frequency prior (AssemblyTemplateDB) that provides a useful completion signal even from a single uploaded body with no graph context.</w:t>
       </w:r>
     </w:p>
     <w:p>
@@ -454,7 +454,7 @@
           <w:sz w:val="20"/>
           <w:szCs w:val="20"/>
         </w:rPr>
-        <w:t xml:space="preserve">A GNNExplainer-based, natural-language explanation layer that turns raw attribution scores into engineering-readable justifications for each prediction, evaluated live against real uploaded STEP files.</w:t>
+        <w:t xml:space="preserve">A GNNExplainer-based, natural-language explanation layer that translates raw attribution scores into engineering-readable justifications for each prediction, evaluated live against real uploaded STEP files.</w:t>
       </w:r>
     </w:p>
     <w:p>
@@ -488,7 +488,7 @@
           <w:sz w:val="20"/>
           <w:szCs w:val="20"/>
         </w:rPr>
-        <w:t xml:space="preserve">The rest of this paper is organised as follows. Section 2 surveys related work in CAD generation and graph representation learning. Section 3 describes the shared graph-construction pipeline and encoder. Sections 4 and 5 detail Phase I detection and Phase II recommendation/generation respectively. Section 6 covers the two supporting contributions. Section 7 reports engineering challenges encountered building the system. Section 8 describes the experimental corpus and protocol, Section 9 reports results and two engineering findings, and Section 10 concludes with limitations and future work.</w:t>
+        <w:t xml:space="preserve">The remainder of this paper is organised as follows. Section 2 surveys related work in CAD generation and graph representation learning. Section 3 outlines the shared graph-construction pipeline and encoder. Sections 4 and 5 detail Phase I detection and Phase II recommendation/generation, respectively. Section 6 covers the two supporting contributions. Section 7 reports engineering challenges encountered building the system. Section 8 describes the experimental corpus and protocol, Section 9 discusses results and two engineering findings, and Section 10 concludes with limitations and future work.</w:t>
       </w:r>
     </w:p>
     <w:p>
@@ -528,7 +528,7 @@
           <w:sz w:val="20"/>
           <w:szCs w:val="20"/>
         </w:rPr>
-        <w:t xml:space="preserve">Recent work generates CAD geometry directly: BrepGen </w:t>
+        <w:t xml:space="preserve">Recent research has focused on generating CAD geometry directly. BrepGen </w:t>
       </w:r>
       <w:r>
         <w:rPr>
@@ -639,7 +639,7 @@
           <w:sz w:val="20"/>
           <w:szCs w:val="20"/>
         </w:rPr>
-        <w:t xml:space="preserve"> synthesises CAD construction sequences from natural-language spatial reasoning. All three generate individual parts or full designs from a specification or a prior distribution; none consumes a partially-built assembly and reasons about what specific component is missing from it — the problem this paper addresses is complementary, not competing.</w:t>
+        <w:t xml:space="preserve"> synthesises CAD construction sequences from natural-language spatial reasoning. These models generate individual parts or entire designs from a specification or a prior distribution. None of them address the problem of reasoning about which specific component is missing from a partly built assembly, which this paper addresses as a complementary problem.</w:t>
       </w:r>
     </w:p>
     <w:p>
@@ -743,7 +743,7 @@
           <w:sz w:val="20"/>
           <w:szCs w:val="20"/>
         </w:rPr>
-        <w:t xml:space="preserve"> established the modern toolkit for relational learning; relational-attention variants such as RGATConv </w:t>
+        <w:t xml:space="preserve"> established the modern toolkit for learning over irregular relational data. Relational-attention variants like RGATConv </w:t>
       </w:r>
       <w:r>
         <w:rPr>
@@ -780,7 +780,7 @@
           <w:sz w:val="20"/>
           <w:szCs w:val="20"/>
         </w:rPr>
-        <w:t xml:space="preserve"> extend attention with per-edge-type parameters — the mechanism this work builds on, since a joint's type materially changes how connected bodies should influence each other. A recent analysis questions how much link-prediction performance owes to structural heuristics rather than learned features </w:t>
+        <w:t xml:space="preserve"> extend attention with per-edge-type parameters, which is the mechanism this work builds on directly since the type of a mechanical joint materially changes how two connected bodies should influence each other. A recent theoretical analysis questions how much link-prediction performance is attributable to simple structural heuristics rather than learned features </w:t>
       </w:r>
       <w:r>
         <w:rPr>
@@ -817,7 +817,7 @@
           <w:sz w:val="20"/>
           <w:szCs w:val="20"/>
         </w:rPr>
-        <w:t xml:space="preserve">; our features lean on affine-invariant shape descriptors over pure topology, which should reduce that risk. Heterogeneous graph contrastive learning </w:t>
+        <w:t xml:space="preserve">; our features are dominated by affine-invariant shape descriptors rather than pure topology, which makes the encoder less susceptible to that failure mode. Heterogeneous graph contrastive learning </w:t>
       </w:r>
       <w:r>
         <w:rPr>
@@ -854,7 +854,7 @@
           <w:sz w:val="20"/>
           <w:szCs w:val="20"/>
         </w:rPr>
-        <w:t xml:space="preserve"> is a related self-supervised alternative to the supervised objectives used here.</w:t>
+        <w:t xml:space="preserve"> is a related but self-supervised alternative to the supervised objectives used here.</w:t>
       </w:r>
     </w:p>
     <w:p>
@@ -879,7 +879,7 @@
           <w:sz w:val="20"/>
           <w:szCs w:val="20"/>
         </w:rPr>
-        <w:t xml:space="preserve">Large open datasets such as ABC </w:t>
+        <w:t xml:space="preserve">Large open datasets like ABC </w:t>
       </w:r>
       <w:r>
         <w:rPr>
@@ -953,7 +953,7 @@
           <w:sz w:val="20"/>
           <w:szCs w:val="20"/>
         </w:rPr>
-        <w:t xml:space="preserve"> have driven progress in learned shape understanding, but both are dominated by consumer and generic-object geometry rather than the industrial fastener- and joint-heavy assemblies this system targets; we curate our own corpus for that reason (Section 8.1).</w:t>
+        <w:t xml:space="preserve"> have been central to progress in learned shape understanding, but both are dominated by consumer and generic-object geometry rather than the industrial fastener- and joint-heavy assemblies targeted by this system. For this reason, we curate our own corpus (Section 8.1).</w:t>
       </w:r>
     </w:p>
     <w:p>
@@ -1015,7 +1015,7 @@
           <w:sz w:val="20"/>
           <w:szCs w:val="20"/>
         </w:rPr>
-        <w:t xml:space="preserve"> produces post-hoc subgraph and feature attributions for a trained GNN's prediction, used here as the numerical backbone for Section 6's explanation layer, which translates its attribution scores into natural-language engineering justifications rather than exposing raw importance weights.</w:t>
+        <w:t xml:space="preserve"> produces post-hoc subgraph and feature attributions for a trained GNN's prediction. We use it as the numerical backbone for the explanation layer in Section 6, translating its attribution scores into natural-language engineering justifications rather than presenting them as raw importance weights.</w:t>
       </w:r>
     </w:p>
     <w:p>
@@ -1040,7 +1040,7 @@
           <w:sz w:val="20"/>
           <w:szCs w:val="20"/>
         </w:rPr>
-        <w:t xml:space="preserve">Shallow, structure-only embedding methods such as node2vec </w:t>
+        <w:t xml:space="preserve">Shallow, structure-only embedding methods like node2vec </w:t>
       </w:r>
       <w:r>
         <w:rPr>
@@ -1077,7 +1077,7 @@
           <w:sz w:val="20"/>
           <w:szCs w:val="20"/>
         </w:rPr>
-        <w:t xml:space="preserve"> learn node representations from random-walk co-occurrence alone, with no mechanism to consume continuous node or edge attributes — a significant loss of signal for a graph whose edges carry a physically meaningful joint-type label, motivating the attention-based, feature-aware encoder in Section 3.2 instead.</w:t>
+        <w:t xml:space="preserve"> learn node representations from random-walk co-occurrence alone, without the ability to consume continuous node or edge attributes. For a graph whose edges carry a physically meaningful joint-type label, discarding that information would result in a significant loss of signal, motivating the attention-based, feature-aware encoder in Section 3.2 instead.</w:t>
       </w:r>
     </w:p>
     <w:p>
@@ -1107,7 +1107,7 @@
           <w:sz w:val="20"/>
           <w:szCs w:val="20"/>
         </w:rPr>
-        <w:t xml:space="preserve">Figure 1 summarises the full pipeline: a STEP file is converted to an attributed graph, encoded once by a shared relational-attention network, and consumed by three task heads. Two supporting modules — the AssemblyTemplateDB prior and the Octree open-surface detector — operate independently of the encoder and join their evidence directly at the explanation layer alongside the task heads' outputs.</w:t>
+        <w:t xml:space="preserve">Figure 1 summarises the complete pipeline: a STEP file is converted into an attributed graph, encoded once by a shared relational-attention network, and processed by three task heads. Two supporting modules — the AssemblyTemplateDB prior and the Octree open-surface detector — operate independently of the encoder and contribute their evidence directly at the explanation layer alongside the task heads' outputs.</w:t>
       </w:r>
     </w:p>
     <w:p>
@@ -1197,7 +1197,7 @@
           <w:sz w:val="20"/>
           <w:szCs w:val="20"/>
         </w:rPr>
-        <w:t xml:space="preserve">Each STEP assembly file is parsed with gmsh (OpenCASCADE kernel), fragmented into individual solid bodies, and converted into an attributed graph: one node per solid body, one edge per pair of bodies whose boundary face sets physically intersect after fragmentation (a real shared contact, not spatial proximity). Two bodies with no shared boundary get no edge, however close they sit in space.</w:t>
+        <w:t xml:space="preserve">Each STEP assembly file is parsed using gmsh (OpenCASCADE kernel), divided into individual solid bodies, and transformed into an attributed graph: one node per solid body and one edge for each pair of bodies whose boundary face sets physically intersect after fragmentation (indicating a real shared contact, not just spatial proximity). Bodies without a shared boundary do not get an edge, regardless of how close they are in space.</w:t>
       </w:r>
     </w:p>
     <w:p>
@@ -1222,7 +1222,7 @@
           <w:sz w:val="20"/>
           <w:szCs w:val="20"/>
         </w:rPr>
-        <w:t xml:space="preserve">Every body carries: an 8-class component-type one-hot (long/short shaft, thick/thin plate, bolt, washer, nut, body — assigned by multi-signal geometric voting over hole detection, bolt-head detection, and absolute-size gating, replacing an earlier single-signal SDF rule); log-scaled volume and exact surface area (via trimesh, not a bounding-box approximation); three scale-normalised bounding-box extents; five affine-invariant shape descriptors (elongation, flatness, two aspect ratios, sphericity); Shape Diameter Function (SDF) mean and variance from inward ray-casting; a surface-area-to-volume ratio; and twelve hole-geometry descriptors added for this corpus revision — hole count, a binary has-holes flag, through/counterbore/indentation/filled-hole fractions and their corresponding binary flags, mean and maximum hole diameter, and a flag for whether a hole's local surroundings are curved rather than flat (fasteners essentially never mount on a curved outer surface, so this distinguishes a genuine mounting hole from an incidental one).</w:t>
+        <w:t xml:space="preserve">Each body includes: an 8-class component-type one-hot encoding (long/short shaft, thick/thin plate, bolt, washer, nut, body — assigned through multi-signal geometric voting over hole detection, bolt-head detection, and absolute-size gating, replacing a previous single-signal SDF rule); log-scaled volume and exact surface area (via trimesh, not a bounding-box approximation); three scale-normalised bounding-box extents; five affine-invariant shape descriptors (elongation, flatness, two aspect ratios, sphericity); Shape Diameter Function (SDF) mean and variance from inward ray-casting; a surface-area-to-volume ratio; and twelve hole-geometry descriptors added for this corpus revision — hole count, a binary has-holes flag, through/counterbore/indentation/filled-hole fractions and their corresponding binary flags, mean and maximum hole diameter, and a flag indicating whether a hole's local surroundings are curved rather than flat (fasteners almost never mount on a curved outer surface, so this distinguishes a genuine mounting hole from an incidental one).</w:t>
       </w:r>
     </w:p>
     <w:p>
@@ -1247,7 +1247,7 @@
           <w:sz w:val="20"/>
           <w:szCs w:val="20"/>
         </w:rPr>
-        <w:t xml:space="preserve">Two dimensions encode the mate type and a real contact-area weight (the shared-surface area ratio between the two bodies, replacing an earlier hardcoded constant), and four encode a one-hot joint-type classification (rigid, revolute, slider, cylindrical) inferred from the local contact geometry.</w:t>
+        <w:t xml:space="preserve">Two dimensions encode the mate type and a real contact-area weight (the shared-surface area ratio between the two bodies, replacing a previous hardcoded constant), and four encode a one-hot joint-type classification (rigid, revolute, slider, cylindrical) inferred from the local contact geometry.</w:t>
       </w:r>
     </w:p>
     <w:p>
@@ -2049,7 +2049,7 @@
           <w:sz w:val="20"/>
           <w:szCs w:val="20"/>
         </w:rPr>
-        <w:t xml:space="preserve">Phase I frames missing-component detection as inductive link prediction. Given the encoder's node embeddings z_u, z_v (dimension 64) for a candidate body pair (u,v), a two-layer MLP head scores the pair:</w:t>
+        <w:t xml:space="preserve">Phase I frames missing-component detection as inductive link prediction. For a candidate body pair (u,v), given the encoder's node embeddings z_u, z_v (dimension 64), a two-layer MLP head scores the pair:</w:t>
       </w:r>
     </w:p>
     <w:p>
@@ -2110,7 +2110,7 @@
           <w:sz w:val="20"/>
           <w:szCs w:val="20"/>
         </w:rPr>
-        <w:t xml:space="preserve">Phase II answers two questions once Phase I has flagged that something is missing: what component type is most likely absent, and what should it look like. Both heads reuse the frozen Phase I encoder and train only their own parameters.</w:t>
+        <w:t xml:space="preserve">Phase II addresses two questions after Phase I has flagged a missing component: what component type is most likely absent, and what should it look like. Both heads reuse the frozen Phase I encoder and train only their own parameters.</w:t>
       </w:r>
     </w:p>
     <w:p>
@@ -2140,7 +2140,7 @@
           <w:sz w:val="20"/>
           <w:szCs w:val="20"/>
         </w:rPr>
-        <w:t xml:space="preserve">Given the embeddings of the assembly's known nodes {z_i}, a mean-pooled context vector c = mean_i(z_i) is projected through a single learned linear layer and compared to each of the eight candidate component-type embeddings by cosine similarity, scaled by a learnable CLIP-style temperature τ:</w:t>
+        <w:t xml:space="preserve">Using the embeddings of the assembly's known nodes {z_i}, a mean-pooled context vector c = mean_i(z_i) is projected through a single learned linear layer and compared to each of the eight candidate component-type embeddings by cosine similarity, scaled by a learnable CLIP-style temperature τ:</w:t>
       </w:r>
     </w:p>
     <w:p>
@@ -2238,7 +2238,7 @@
           <w:sz w:val="20"/>
           <w:szCs w:val="20"/>
         </w:rPr>
-        <w:t xml:space="preserve">Once a component type is recommended, the system must produce an actual mesh, not just a label. HybridShapeGenerator tries two strategies in order.</w:t>
+        <w:t xml:space="preserve">After recommending a component type, the system must produce an actual mesh, not just a label. HybridShapeGenerator tries two strategies in order.</w:t>
       </w:r>
     </w:p>
     <w:p>
@@ -2344,7 +2344,7 @@
           <w:sz w:val="20"/>
           <w:szCs w:val="20"/>
         </w:rPr>
-        <w:t xml:space="preserve">To locate where a missing component likely attaches without depending on a proprietary CAD-kernel API at inference time, an octree spatial partition — adapting the octree concept from prior mesh-watermarking work </w:t>
+        <w:t xml:space="preserve">To identify where a missing component likely attaches without relying on a proprietary CAD-kernel API at inference time, an octree spatial partition — adapting the octree concept from prior mesh-watermarking work </w:t>
       </w:r>
       <w:r>
         <w:rPr>
@@ -3843,7 +3843,7 @@
           <w:sz w:val="20"/>
           <w:szCs w:val="20"/>
         </w:rPr>
-        <w:t xml:space="preserve">Table 3 reports Phase I's five-fold cross-validated performance. Mean AUC-ROC is 0.9206 (±0.0121) and mean AP is 0.9020 (±0.0120) against a chance-level AP of 0.500, indicating the encoder separates real from candidate connections consistently across folds rather than only on a favourable split.</w:t>
+        <w:t xml:space="preserve">Table 3 reports Phase I's five-fold cross-validated performance. Mean AUC-ROC is 0.9206 (±0.0121) and mean AP is 0.9020 (±0.0120) against a chance-level AP of 0.500, indicating the encoder consistently separates real from candidate connections across folds rather than only on a favourable split.</w:t>
       </w:r>
     </w:p>
     <w:tbl>
@@ -4898,7 +4898,7 @@
           <w:sz w:val="20"/>
           <w:szCs w:val="20"/>
         </w:rPr>
-        <w:t xml:space="preserve">NodeRanker reaches Hit@1 of 0.4093 against a majority-class baseline of 0.3442 — a genuine improvement over always predicting the plurality class (body, 35.5% of the corpus), not the exact tie this head produced in earlier corpus revisions. Hit@5 reaches 0.9101, MRR 0.6102, NDCG@5 0.6754. Table 5 breaks Hit@1 down by type: performance is markedly uneven, body (majority) at 0.689 against washer at 0.0 and thin_plate at 0.024, and the head over-predicts body relative to its true frequency (64.7% of predictions vs. 41.3% true share) — an unresolved majority-class bias, reported honestly rather than obscured by the headline number (Section 10).</w:t>
+        <w:t xml:space="preserve">NodeRanker achieves a Hit@1 of 0.4093 against a majority-class baseline of 0.3442 — a genuine improvement over always predicting the plurality class (body, 35.5% of the corpus), not the exact tie this head produced in earlier corpus revisions. Hit@5 reaches 0.9101, MRR 0.6102, NDCG@5 0.6754. Table 5 breaks Hit@1 down by type: performance is markedly uneven, body (majority) at 0.689 against washer at 0.0 and thin_plate at 0.024, and the head over-predicts body relative to its true frequency (64.7% of predictions vs. 41.3% true share) — an unresolved majority-class bias, reported honestly rather than obscured by the headline number (Section 10).</w:t>
       </w:r>
     </w:p>
     <w:tbl>

</xml_diff>